<commit_message>
Aggiornamento documentazione e schema
Schema e documentazione aggiornati alle ultime modifiche (FNCSDP)
</commit_message>
<xml_diff>
--- a/docs/PW19_BaseDatiNis2_Documentazione.docx
+++ b/docs/PW19_BaseDatiNis2_Documentazione.docx
@@ -2188,10 +2188,40 @@
     </w:p>
     <w:p>
       <w:pPr>
-        <w:spacing w:after="160"/>
+        <w:pStyle w:val="Heading2"/>
+        <w:rPr>
+          <w:rFonts w:ascii="Arial" w:eastAsia="Arial" w:hAnsi="Arial" w:cs="Arial"/>
+          <w:b/>
+          <w:bCs/>
+          <w:color w:val="2E75B6"/>
+          <w:sz w:val="26"/>
+          <w:szCs w:val="26"/>
+        </w:rPr>
       </w:pPr>
+      <w:r>
+        <w:rPr>
+          <w:rFonts w:ascii="Arial" w:eastAsia="Arial" w:hAnsi="Arial" w:cs="Arial"/>
+          <w:b/>
+          <w:bCs/>
+          <w:color w:val="2E75B6"/>
+          <w:sz w:val="26"/>
+          <w:szCs w:val="26"/>
+        </w:rPr>
+        <w:t>3.5 Profilo Target/Attuale e Gap Analysis (FNCSDP)</w:t>
+      </w:r>
     </w:p>
     <w:p>
+      <w:pPr>
+        <w:jc w:val="both"/>
+      </w:pPr>
+      <w:r>
+        <w:t>Oltre allo stato di attuazione delle singole misure, il modello rappresenta la postura di sicurezza secondo la metodologia del Framework Nazionale per la Cybersecurity e la Data Protection (FNCSDP, ed. 2025 v2.1). Per ciascuna Subcategory del Core, la tabella assessment memorizza un livello target (stato desiderato) e un livello attuale (stato rilevato) su scala 0-4, con la relativa priorita'; la lookup framework_subcategory descrive le Subcategory. Il gap tra i due profili, esposto dalla vista v_gap_analysis, individua gli interventi necessari e ne definisce la priorita'.</w:t>
+      </w:r>
+    </w:p>
+    <w:p>
+      <w:pPr>
+        <w:spacing w:after="160" w:line="259" w:lineRule="auto"/>
+      </w:pPr>
       <w:r>
         <w:br w:type="page"/>
       </w:r>
@@ -2974,6 +3004,14 @@
     <w:p>
       <w:pPr>
         <w:pStyle w:val="Heading2"/>
+        <w:rPr>
+          <w:rFonts w:ascii="Arial" w:eastAsia="Arial" w:hAnsi="Arial" w:cs="Arial"/>
+          <w:b/>
+          <w:bCs/>
+          <w:color w:val="2E75B6"/>
+          <w:sz w:val="26"/>
+          <w:szCs w:val="26"/>
+        </w:rPr>
       </w:pPr>
       <w:r>
         <w:rPr>
@@ -2984,7 +3022,1223 @@
           <w:sz w:val="26"/>
           <w:szCs w:val="26"/>
         </w:rPr>
-        <w:t>4.2  organizzazione</w:t>
+        <w:t>4.2  framework_subcategory</w:t>
+      </w:r>
+    </w:p>
+    <w:p>
+      <w:pPr>
+        <w:spacing w:after="240"/>
+        <w:jc w:val="both"/>
+      </w:pPr>
+      <w:r>
+        <w:t>Lookup delle Subcategory del Core del Framework Nazionale (ed. 2025 v2.1), referenziata da assessment e da misura_sicurezza.</w:t>
+      </w:r>
+    </w:p>
+    <w:tbl>
+      <w:tblPr>
+        <w:tblW w:w="9026" w:type="dxa"/>
+        <w:tblBorders>
+          <w:top w:val="single" w:sz="4" w:space="0" w:color="auto"/>
+          <w:left w:val="single" w:sz="4" w:space="0" w:color="auto"/>
+          <w:bottom w:val="single" w:sz="4" w:space="0" w:color="auto"/>
+          <w:right w:val="single" w:sz="4" w:space="0" w:color="auto"/>
+          <w:insideH w:val="single" w:sz="4" w:space="0" w:color="auto"/>
+          <w:insideV w:val="single" w:sz="4" w:space="0" w:color="auto"/>
+        </w:tblBorders>
+        <w:tblCellMar>
+          <w:left w:w="10" w:type="dxa"/>
+          <w:right w:w="10" w:type="dxa"/>
+        </w:tblCellMar>
+        <w:tblLook w:val="04A0" w:firstRow="1" w:lastRow="0" w:firstColumn="1" w:lastColumn="0" w:noHBand="0" w:noVBand="1"/>
+      </w:tblPr>
+      <w:tblGrid>
+        <w:gridCol w:w="1731"/>
+        <w:gridCol w:w="1541"/>
+        <w:gridCol w:w="639"/>
+        <w:gridCol w:w="1711"/>
+        <w:gridCol w:w="3404"/>
+      </w:tblGrid>
+      <w:tr>
+        <w:trPr>
+          <w:tblHeader/>
+        </w:trPr>
+        <w:tc>
+          <w:tcPr>
+            <w:tcW w:w="1731" w:type="dxa"/>
+            <w:tcBorders>
+              <w:top w:val="single" w:sz="1" w:space="0" w:color="CCCCCC"/>
+              <w:left w:val="single" w:sz="1" w:space="0" w:color="CCCCCC"/>
+              <w:bottom w:val="single" w:sz="1" w:space="0" w:color="CCCCCC"/>
+              <w:right w:val="single" w:sz="1" w:space="0" w:color="CCCCCC"/>
+            </w:tcBorders>
+            <w:shd w:val="clear" w:color="auto" w:fill="D5E8F0"/>
+            <w:tcMar>
+              <w:top w:w="80" w:type="dxa"/>
+              <w:left w:w="120" w:type="dxa"/>
+              <w:bottom w:w="80" w:type="dxa"/>
+              <w:right w:w="120" w:type="dxa"/>
+            </w:tcMar>
+          </w:tcPr>
+          <w:p>
+            <w:r>
+              <w:rPr>
+                <w:b/>
+                <w:bCs/>
+                <w:sz w:val="18"/>
+                <w:szCs w:val="18"/>
+              </w:rPr>
+              <w:t>Campo</w:t>
+            </w:r>
+          </w:p>
+        </w:tc>
+        <w:tc>
+          <w:tcPr>
+            <w:tcW w:w="1541" w:type="dxa"/>
+            <w:tcBorders>
+              <w:top w:val="single" w:sz="1" w:space="0" w:color="CCCCCC"/>
+              <w:left w:val="single" w:sz="1" w:space="0" w:color="CCCCCC"/>
+              <w:bottom w:val="single" w:sz="1" w:space="0" w:color="CCCCCC"/>
+              <w:right w:val="single" w:sz="1" w:space="0" w:color="CCCCCC"/>
+            </w:tcBorders>
+            <w:shd w:val="clear" w:color="auto" w:fill="D5E8F0"/>
+            <w:tcMar>
+              <w:top w:w="80" w:type="dxa"/>
+              <w:left w:w="120" w:type="dxa"/>
+              <w:bottom w:w="80" w:type="dxa"/>
+              <w:right w:w="120" w:type="dxa"/>
+            </w:tcMar>
+          </w:tcPr>
+          <w:p>
+            <w:r>
+              <w:rPr>
+                <w:b/>
+                <w:bCs/>
+                <w:sz w:val="18"/>
+                <w:szCs w:val="18"/>
+              </w:rPr>
+              <w:t>Tipo PostgreSQL</w:t>
+            </w:r>
+          </w:p>
+        </w:tc>
+        <w:tc>
+          <w:tcPr>
+            <w:tcW w:w="639" w:type="dxa"/>
+            <w:tcBorders>
+              <w:top w:val="single" w:sz="1" w:space="0" w:color="CCCCCC"/>
+              <w:left w:val="single" w:sz="1" w:space="0" w:color="CCCCCC"/>
+              <w:bottom w:val="single" w:sz="1" w:space="0" w:color="CCCCCC"/>
+              <w:right w:val="single" w:sz="1" w:space="0" w:color="CCCCCC"/>
+            </w:tcBorders>
+            <w:shd w:val="clear" w:color="auto" w:fill="D5E8F0"/>
+            <w:tcMar>
+              <w:top w:w="80" w:type="dxa"/>
+              <w:left w:w="120" w:type="dxa"/>
+              <w:bottom w:w="80" w:type="dxa"/>
+              <w:right w:w="120" w:type="dxa"/>
+            </w:tcMar>
+          </w:tcPr>
+          <w:p>
+            <w:r>
+              <w:rPr>
+                <w:b/>
+                <w:bCs/>
+                <w:sz w:val="18"/>
+                <w:szCs w:val="18"/>
+              </w:rPr>
+              <w:t>Req.</w:t>
+            </w:r>
+          </w:p>
+        </w:tc>
+        <w:tc>
+          <w:tcPr>
+            <w:tcW w:w="1711" w:type="dxa"/>
+            <w:tcBorders>
+              <w:top w:val="single" w:sz="1" w:space="0" w:color="CCCCCC"/>
+              <w:left w:val="single" w:sz="1" w:space="0" w:color="CCCCCC"/>
+              <w:bottom w:val="single" w:sz="1" w:space="0" w:color="CCCCCC"/>
+              <w:right w:val="single" w:sz="1" w:space="0" w:color="CCCCCC"/>
+            </w:tcBorders>
+            <w:shd w:val="clear" w:color="auto" w:fill="D5E8F0"/>
+            <w:tcMar>
+              <w:top w:w="80" w:type="dxa"/>
+              <w:left w:w="120" w:type="dxa"/>
+              <w:bottom w:w="80" w:type="dxa"/>
+              <w:right w:w="120" w:type="dxa"/>
+            </w:tcMar>
+          </w:tcPr>
+          <w:p>
+            <w:r>
+              <w:rPr>
+                <w:b/>
+                <w:bCs/>
+                <w:sz w:val="18"/>
+                <w:szCs w:val="18"/>
+              </w:rPr>
+              <w:t>Vincoli / Default</w:t>
+            </w:r>
+          </w:p>
+        </w:tc>
+        <w:tc>
+          <w:tcPr>
+            <w:tcW w:w="3404" w:type="dxa"/>
+            <w:tcBorders>
+              <w:top w:val="single" w:sz="1" w:space="0" w:color="CCCCCC"/>
+              <w:left w:val="single" w:sz="1" w:space="0" w:color="CCCCCC"/>
+              <w:bottom w:val="single" w:sz="1" w:space="0" w:color="CCCCCC"/>
+              <w:right w:val="single" w:sz="1" w:space="0" w:color="CCCCCC"/>
+            </w:tcBorders>
+            <w:shd w:val="clear" w:color="auto" w:fill="D5E8F0"/>
+            <w:tcMar>
+              <w:top w:w="80" w:type="dxa"/>
+              <w:left w:w="120" w:type="dxa"/>
+              <w:bottom w:w="80" w:type="dxa"/>
+              <w:right w:w="120" w:type="dxa"/>
+            </w:tcMar>
+          </w:tcPr>
+          <w:p>
+            <w:r>
+              <w:rPr>
+                <w:b/>
+                <w:bCs/>
+                <w:sz w:val="18"/>
+                <w:szCs w:val="18"/>
+              </w:rPr>
+              <w:t>Descrizione</w:t>
+            </w:r>
+          </w:p>
+        </w:tc>
+      </w:tr>
+      <w:tr>
+        <w:tc>
+          <w:tcPr>
+            <w:tcW w:w="1731" w:type="dxa"/>
+            <w:tcBorders>
+              <w:top w:val="single" w:sz="1" w:space="0" w:color="CCCCCC"/>
+              <w:left w:val="single" w:sz="1" w:space="0" w:color="CCCCCC"/>
+              <w:bottom w:val="single" w:sz="1" w:space="0" w:color="CCCCCC"/>
+              <w:right w:val="single" w:sz="1" w:space="0" w:color="CCCCCC"/>
+            </w:tcBorders>
+            <w:tcMar>
+              <w:top w:w="80" w:type="dxa"/>
+              <w:left w:w="120" w:type="dxa"/>
+              <w:bottom w:w="80" w:type="dxa"/>
+              <w:right w:w="120" w:type="dxa"/>
+            </w:tcMar>
+          </w:tcPr>
+          <w:p>
+            <w:pPr>
+              <w:rPr>
+                <w:sz w:val="18"/>
+                <w:szCs w:val="18"/>
+              </w:rPr>
+            </w:pPr>
+            <w:r>
+              <w:rPr>
+                <w:sz w:val="18"/>
+                <w:szCs w:val="18"/>
+              </w:rPr>
+              <w:t>codice</w:t>
+            </w:r>
+          </w:p>
+        </w:tc>
+        <w:tc>
+          <w:tcPr>
+            <w:tcW w:w="1541" w:type="dxa"/>
+            <w:tcBorders>
+              <w:top w:val="single" w:sz="1" w:space="0" w:color="CCCCCC"/>
+              <w:left w:val="single" w:sz="1" w:space="0" w:color="CCCCCC"/>
+              <w:bottom w:val="single" w:sz="1" w:space="0" w:color="CCCCCC"/>
+              <w:right w:val="single" w:sz="1" w:space="0" w:color="CCCCCC"/>
+            </w:tcBorders>
+            <w:tcMar>
+              <w:top w:w="80" w:type="dxa"/>
+              <w:left w:w="120" w:type="dxa"/>
+              <w:bottom w:w="80" w:type="dxa"/>
+              <w:right w:w="120" w:type="dxa"/>
+            </w:tcMar>
+          </w:tcPr>
+          <w:p>
+            <w:pPr>
+              <w:rPr>
+                <w:sz w:val="18"/>
+                <w:szCs w:val="18"/>
+              </w:rPr>
+            </w:pPr>
+            <w:r>
+              <w:rPr>
+                <w:sz w:val="18"/>
+                <w:szCs w:val="18"/>
+              </w:rPr>
+              <w:t>VARCHAR(15)</w:t>
+            </w:r>
+          </w:p>
+        </w:tc>
+        <w:tc>
+          <w:tcPr>
+            <w:tcW w:w="639" w:type="dxa"/>
+            <w:tcBorders>
+              <w:top w:val="single" w:sz="1" w:space="0" w:color="CCCCCC"/>
+              <w:left w:val="single" w:sz="1" w:space="0" w:color="CCCCCC"/>
+              <w:bottom w:val="single" w:sz="1" w:space="0" w:color="CCCCCC"/>
+              <w:right w:val="single" w:sz="1" w:space="0" w:color="CCCCCC"/>
+            </w:tcBorders>
+            <w:tcMar>
+              <w:top w:w="80" w:type="dxa"/>
+              <w:left w:w="120" w:type="dxa"/>
+              <w:bottom w:w="80" w:type="dxa"/>
+              <w:right w:w="120" w:type="dxa"/>
+            </w:tcMar>
+          </w:tcPr>
+          <w:p>
+            <w:pPr>
+              <w:rPr>
+                <w:sz w:val="18"/>
+                <w:szCs w:val="18"/>
+              </w:rPr>
+            </w:pPr>
+            <w:r>
+              <w:rPr>
+                <w:sz w:val="18"/>
+                <w:szCs w:val="18"/>
+              </w:rPr>
+              <w:t>Si</w:t>
+            </w:r>
+          </w:p>
+        </w:tc>
+        <w:tc>
+          <w:tcPr>
+            <w:tcW w:w="1711" w:type="dxa"/>
+            <w:tcBorders>
+              <w:top w:val="single" w:sz="1" w:space="0" w:color="CCCCCC"/>
+              <w:left w:val="single" w:sz="1" w:space="0" w:color="CCCCCC"/>
+              <w:bottom w:val="single" w:sz="1" w:space="0" w:color="CCCCCC"/>
+              <w:right w:val="single" w:sz="1" w:space="0" w:color="CCCCCC"/>
+            </w:tcBorders>
+            <w:tcMar>
+              <w:top w:w="80" w:type="dxa"/>
+              <w:left w:w="120" w:type="dxa"/>
+              <w:bottom w:w="80" w:type="dxa"/>
+              <w:right w:w="120" w:type="dxa"/>
+            </w:tcMar>
+          </w:tcPr>
+          <w:p>
+            <w:pPr>
+              <w:rPr>
+                <w:sz w:val="18"/>
+                <w:szCs w:val="18"/>
+              </w:rPr>
+            </w:pPr>
+            <w:r>
+              <w:rPr>
+                <w:sz w:val="18"/>
+                <w:szCs w:val="18"/>
+              </w:rPr>
+              <w:t>PRIMARY KEY</w:t>
+            </w:r>
+          </w:p>
+        </w:tc>
+        <w:tc>
+          <w:tcPr>
+            <w:tcW w:w="3404" w:type="dxa"/>
+            <w:tcBorders>
+              <w:top w:val="single" w:sz="1" w:space="0" w:color="CCCCCC"/>
+              <w:left w:val="single" w:sz="1" w:space="0" w:color="CCCCCC"/>
+              <w:bottom w:val="single" w:sz="1" w:space="0" w:color="CCCCCC"/>
+              <w:right w:val="single" w:sz="1" w:space="0" w:color="CCCCCC"/>
+            </w:tcBorders>
+            <w:tcMar>
+              <w:top w:w="80" w:type="dxa"/>
+              <w:left w:w="120" w:type="dxa"/>
+              <w:bottom w:w="80" w:type="dxa"/>
+              <w:right w:w="120" w:type="dxa"/>
+            </w:tcMar>
+          </w:tcPr>
+          <w:p>
+            <w:pPr>
+              <w:rPr>
+                <w:sz w:val="18"/>
+                <w:szCs w:val="18"/>
+              </w:rPr>
+            </w:pPr>
+            <w:r>
+              <w:rPr>
+                <w:sz w:val="18"/>
+                <w:szCs w:val="18"/>
+              </w:rPr>
+              <w:t>Codice della Subcategory (es. ID.AM-01)</w:t>
+            </w:r>
+          </w:p>
+        </w:tc>
+      </w:tr>
+      <w:tr>
+        <w:tc>
+          <w:tcPr>
+            <w:tcW w:w="1731" w:type="dxa"/>
+            <w:tcBorders>
+              <w:top w:val="single" w:sz="1" w:space="0" w:color="CCCCCC"/>
+              <w:left w:val="single" w:sz="1" w:space="0" w:color="CCCCCC"/>
+              <w:bottom w:val="single" w:sz="1" w:space="0" w:color="CCCCCC"/>
+              <w:right w:val="single" w:sz="1" w:space="0" w:color="CCCCCC"/>
+            </w:tcBorders>
+            <w:shd w:val="clear" w:color="auto" w:fill="F2F2F2"/>
+            <w:tcMar>
+              <w:top w:w="80" w:type="dxa"/>
+              <w:left w:w="120" w:type="dxa"/>
+              <w:bottom w:w="80" w:type="dxa"/>
+              <w:right w:w="120" w:type="dxa"/>
+            </w:tcMar>
+          </w:tcPr>
+          <w:p>
+            <w:pPr>
+              <w:rPr>
+                <w:sz w:val="18"/>
+                <w:szCs w:val="18"/>
+              </w:rPr>
+            </w:pPr>
+            <w:r>
+              <w:rPr>
+                <w:sz w:val="18"/>
+                <w:szCs w:val="18"/>
+              </w:rPr>
+              <w:t>funzione</w:t>
+            </w:r>
+          </w:p>
+        </w:tc>
+        <w:tc>
+          <w:tcPr>
+            <w:tcW w:w="1541" w:type="dxa"/>
+            <w:tcBorders>
+              <w:top w:val="single" w:sz="1" w:space="0" w:color="CCCCCC"/>
+              <w:left w:val="single" w:sz="1" w:space="0" w:color="CCCCCC"/>
+              <w:bottom w:val="single" w:sz="1" w:space="0" w:color="CCCCCC"/>
+              <w:right w:val="single" w:sz="1" w:space="0" w:color="CCCCCC"/>
+            </w:tcBorders>
+            <w:shd w:val="clear" w:color="auto" w:fill="F2F2F2"/>
+            <w:tcMar>
+              <w:top w:w="80" w:type="dxa"/>
+              <w:left w:w="120" w:type="dxa"/>
+              <w:bottom w:w="80" w:type="dxa"/>
+              <w:right w:w="120" w:type="dxa"/>
+            </w:tcMar>
+          </w:tcPr>
+          <w:p>
+            <w:pPr>
+              <w:rPr>
+                <w:sz w:val="18"/>
+                <w:szCs w:val="18"/>
+              </w:rPr>
+            </w:pPr>
+            <w:r>
+              <w:rPr>
+                <w:sz w:val="18"/>
+                <w:szCs w:val="18"/>
+              </w:rPr>
+              <w:t>CHAR(2)</w:t>
+            </w:r>
+          </w:p>
+        </w:tc>
+        <w:tc>
+          <w:tcPr>
+            <w:tcW w:w="639" w:type="dxa"/>
+            <w:tcBorders>
+              <w:top w:val="single" w:sz="1" w:space="0" w:color="CCCCCC"/>
+              <w:left w:val="single" w:sz="1" w:space="0" w:color="CCCCCC"/>
+              <w:bottom w:val="single" w:sz="1" w:space="0" w:color="CCCCCC"/>
+              <w:right w:val="single" w:sz="1" w:space="0" w:color="CCCCCC"/>
+            </w:tcBorders>
+            <w:shd w:val="clear" w:color="auto" w:fill="F2F2F2"/>
+            <w:tcMar>
+              <w:top w:w="80" w:type="dxa"/>
+              <w:left w:w="120" w:type="dxa"/>
+              <w:bottom w:w="80" w:type="dxa"/>
+              <w:right w:w="120" w:type="dxa"/>
+            </w:tcMar>
+          </w:tcPr>
+          <w:p>
+            <w:pPr>
+              <w:rPr>
+                <w:sz w:val="18"/>
+                <w:szCs w:val="18"/>
+              </w:rPr>
+            </w:pPr>
+            <w:r>
+              <w:rPr>
+                <w:sz w:val="18"/>
+                <w:szCs w:val="18"/>
+              </w:rPr>
+              <w:t>Si</w:t>
+            </w:r>
+          </w:p>
+        </w:tc>
+        <w:tc>
+          <w:tcPr>
+            <w:tcW w:w="1711" w:type="dxa"/>
+            <w:tcBorders>
+              <w:top w:val="single" w:sz="1" w:space="0" w:color="CCCCCC"/>
+              <w:left w:val="single" w:sz="1" w:space="0" w:color="CCCCCC"/>
+              <w:bottom w:val="single" w:sz="1" w:space="0" w:color="CCCCCC"/>
+              <w:right w:val="single" w:sz="1" w:space="0" w:color="CCCCCC"/>
+            </w:tcBorders>
+            <w:shd w:val="clear" w:color="auto" w:fill="F2F2F2"/>
+            <w:tcMar>
+              <w:top w:w="80" w:type="dxa"/>
+              <w:left w:w="120" w:type="dxa"/>
+              <w:bottom w:w="80" w:type="dxa"/>
+              <w:right w:w="120" w:type="dxa"/>
+            </w:tcMar>
+          </w:tcPr>
+          <w:p>
+            <w:pPr>
+              <w:rPr>
+                <w:sz w:val="18"/>
+                <w:szCs w:val="18"/>
+                <w:lang w:val="en-US"/>
+              </w:rPr>
+            </w:pPr>
+            <w:r>
+              <w:rPr>
+                <w:sz w:val="18"/>
+                <w:szCs w:val="18"/>
+                <w:lang w:val="en-US"/>
+              </w:rPr>
+              <w:t>CHECK (GV, ID, PR, DE, RS, RC)</w:t>
+            </w:r>
+          </w:p>
+        </w:tc>
+        <w:tc>
+          <w:tcPr>
+            <w:tcW w:w="3404" w:type="dxa"/>
+            <w:tcBorders>
+              <w:top w:val="single" w:sz="1" w:space="0" w:color="CCCCCC"/>
+              <w:left w:val="single" w:sz="1" w:space="0" w:color="CCCCCC"/>
+              <w:bottom w:val="single" w:sz="1" w:space="0" w:color="CCCCCC"/>
+              <w:right w:val="single" w:sz="1" w:space="0" w:color="CCCCCC"/>
+            </w:tcBorders>
+            <w:shd w:val="clear" w:color="auto" w:fill="F2F2F2"/>
+            <w:tcMar>
+              <w:top w:w="80" w:type="dxa"/>
+              <w:left w:w="120" w:type="dxa"/>
+              <w:bottom w:w="80" w:type="dxa"/>
+              <w:right w:w="120" w:type="dxa"/>
+            </w:tcMar>
+          </w:tcPr>
+          <w:p>
+            <w:pPr>
+              <w:rPr>
+                <w:sz w:val="18"/>
+                <w:szCs w:val="18"/>
+              </w:rPr>
+            </w:pPr>
+            <w:r>
+              <w:rPr>
+                <w:sz w:val="18"/>
+                <w:szCs w:val="18"/>
+              </w:rPr>
+              <w:t>Funzione del Framework</w:t>
+            </w:r>
+          </w:p>
+        </w:tc>
+      </w:tr>
+      <w:tr>
+        <w:tc>
+          <w:tcPr>
+            <w:tcW w:w="1731" w:type="dxa"/>
+            <w:tcBorders>
+              <w:top w:val="single" w:sz="1" w:space="0" w:color="CCCCCC"/>
+              <w:left w:val="single" w:sz="1" w:space="0" w:color="CCCCCC"/>
+              <w:bottom w:val="single" w:sz="1" w:space="0" w:color="CCCCCC"/>
+              <w:right w:val="single" w:sz="1" w:space="0" w:color="CCCCCC"/>
+            </w:tcBorders>
+            <w:tcMar>
+              <w:top w:w="80" w:type="dxa"/>
+              <w:left w:w="120" w:type="dxa"/>
+              <w:bottom w:w="80" w:type="dxa"/>
+              <w:right w:w="120" w:type="dxa"/>
+            </w:tcMar>
+          </w:tcPr>
+          <w:p>
+            <w:pPr>
+              <w:rPr>
+                <w:sz w:val="18"/>
+                <w:szCs w:val="18"/>
+              </w:rPr>
+            </w:pPr>
+            <w:r>
+              <w:rPr>
+                <w:sz w:val="18"/>
+                <w:szCs w:val="18"/>
+              </w:rPr>
+              <w:t>funzione_nome</w:t>
+            </w:r>
+          </w:p>
+        </w:tc>
+        <w:tc>
+          <w:tcPr>
+            <w:tcW w:w="1541" w:type="dxa"/>
+            <w:tcBorders>
+              <w:top w:val="single" w:sz="1" w:space="0" w:color="CCCCCC"/>
+              <w:left w:val="single" w:sz="1" w:space="0" w:color="CCCCCC"/>
+              <w:bottom w:val="single" w:sz="1" w:space="0" w:color="CCCCCC"/>
+              <w:right w:val="single" w:sz="1" w:space="0" w:color="CCCCCC"/>
+            </w:tcBorders>
+            <w:tcMar>
+              <w:top w:w="80" w:type="dxa"/>
+              <w:left w:w="120" w:type="dxa"/>
+              <w:bottom w:w="80" w:type="dxa"/>
+              <w:right w:w="120" w:type="dxa"/>
+            </w:tcMar>
+          </w:tcPr>
+          <w:p>
+            <w:pPr>
+              <w:rPr>
+                <w:sz w:val="18"/>
+                <w:szCs w:val="18"/>
+              </w:rPr>
+            </w:pPr>
+            <w:r>
+              <w:rPr>
+                <w:sz w:val="18"/>
+                <w:szCs w:val="18"/>
+              </w:rPr>
+              <w:t>VARCHAR(20)</w:t>
+            </w:r>
+          </w:p>
+        </w:tc>
+        <w:tc>
+          <w:tcPr>
+            <w:tcW w:w="639" w:type="dxa"/>
+            <w:tcBorders>
+              <w:top w:val="single" w:sz="1" w:space="0" w:color="CCCCCC"/>
+              <w:left w:val="single" w:sz="1" w:space="0" w:color="CCCCCC"/>
+              <w:bottom w:val="single" w:sz="1" w:space="0" w:color="CCCCCC"/>
+              <w:right w:val="single" w:sz="1" w:space="0" w:color="CCCCCC"/>
+            </w:tcBorders>
+            <w:tcMar>
+              <w:top w:w="80" w:type="dxa"/>
+              <w:left w:w="120" w:type="dxa"/>
+              <w:bottom w:w="80" w:type="dxa"/>
+              <w:right w:w="120" w:type="dxa"/>
+            </w:tcMar>
+          </w:tcPr>
+          <w:p>
+            <w:pPr>
+              <w:rPr>
+                <w:sz w:val="18"/>
+                <w:szCs w:val="18"/>
+              </w:rPr>
+            </w:pPr>
+            <w:r>
+              <w:rPr>
+                <w:sz w:val="18"/>
+                <w:szCs w:val="18"/>
+              </w:rPr>
+              <w:t>Si</w:t>
+            </w:r>
+          </w:p>
+        </w:tc>
+        <w:tc>
+          <w:tcPr>
+            <w:tcW w:w="1711" w:type="dxa"/>
+            <w:tcBorders>
+              <w:top w:val="single" w:sz="1" w:space="0" w:color="CCCCCC"/>
+              <w:left w:val="single" w:sz="1" w:space="0" w:color="CCCCCC"/>
+              <w:bottom w:val="single" w:sz="1" w:space="0" w:color="CCCCCC"/>
+              <w:right w:val="single" w:sz="1" w:space="0" w:color="CCCCCC"/>
+            </w:tcBorders>
+            <w:tcMar>
+              <w:top w:w="80" w:type="dxa"/>
+              <w:left w:w="120" w:type="dxa"/>
+              <w:bottom w:w="80" w:type="dxa"/>
+              <w:right w:w="120" w:type="dxa"/>
+            </w:tcMar>
+          </w:tcPr>
+          <w:p>
+            <w:pPr>
+              <w:rPr>
+                <w:sz w:val="18"/>
+                <w:szCs w:val="18"/>
+              </w:rPr>
+            </w:pPr>
+            <w:r>
+              <w:rPr>
+                <w:sz w:val="18"/>
+                <w:szCs w:val="18"/>
+              </w:rPr>
+              <w:t>—</w:t>
+            </w:r>
+          </w:p>
+        </w:tc>
+        <w:tc>
+          <w:tcPr>
+            <w:tcW w:w="3404" w:type="dxa"/>
+            <w:tcBorders>
+              <w:top w:val="single" w:sz="1" w:space="0" w:color="CCCCCC"/>
+              <w:left w:val="single" w:sz="1" w:space="0" w:color="CCCCCC"/>
+              <w:bottom w:val="single" w:sz="1" w:space="0" w:color="CCCCCC"/>
+              <w:right w:val="single" w:sz="1" w:space="0" w:color="CCCCCC"/>
+            </w:tcBorders>
+            <w:tcMar>
+              <w:top w:w="80" w:type="dxa"/>
+              <w:left w:w="120" w:type="dxa"/>
+              <w:bottom w:w="80" w:type="dxa"/>
+              <w:right w:w="120" w:type="dxa"/>
+            </w:tcMar>
+          </w:tcPr>
+          <w:p>
+            <w:pPr>
+              <w:rPr>
+                <w:sz w:val="18"/>
+                <w:szCs w:val="18"/>
+              </w:rPr>
+            </w:pPr>
+            <w:r>
+              <w:rPr>
+                <w:sz w:val="18"/>
+                <w:szCs w:val="18"/>
+              </w:rPr>
+              <w:t>Nome esteso della funzione</w:t>
+            </w:r>
+          </w:p>
+        </w:tc>
+      </w:tr>
+      <w:tr>
+        <w:tc>
+          <w:tcPr>
+            <w:tcW w:w="1731" w:type="dxa"/>
+            <w:tcBorders>
+              <w:top w:val="single" w:sz="1" w:space="0" w:color="CCCCCC"/>
+              <w:left w:val="single" w:sz="1" w:space="0" w:color="CCCCCC"/>
+              <w:bottom w:val="single" w:sz="1" w:space="0" w:color="CCCCCC"/>
+              <w:right w:val="single" w:sz="1" w:space="0" w:color="CCCCCC"/>
+            </w:tcBorders>
+            <w:shd w:val="clear" w:color="auto" w:fill="F2F2F2"/>
+            <w:tcMar>
+              <w:top w:w="80" w:type="dxa"/>
+              <w:left w:w="120" w:type="dxa"/>
+              <w:bottom w:w="80" w:type="dxa"/>
+              <w:right w:w="120" w:type="dxa"/>
+            </w:tcMar>
+          </w:tcPr>
+          <w:p>
+            <w:pPr>
+              <w:rPr>
+                <w:sz w:val="18"/>
+                <w:szCs w:val="18"/>
+              </w:rPr>
+            </w:pPr>
+            <w:r>
+              <w:rPr>
+                <w:sz w:val="18"/>
+                <w:szCs w:val="18"/>
+              </w:rPr>
+              <w:t>categoria_cod</w:t>
+            </w:r>
+          </w:p>
+        </w:tc>
+        <w:tc>
+          <w:tcPr>
+            <w:tcW w:w="1541" w:type="dxa"/>
+            <w:tcBorders>
+              <w:top w:val="single" w:sz="1" w:space="0" w:color="CCCCCC"/>
+              <w:left w:val="single" w:sz="1" w:space="0" w:color="CCCCCC"/>
+              <w:bottom w:val="single" w:sz="1" w:space="0" w:color="CCCCCC"/>
+              <w:right w:val="single" w:sz="1" w:space="0" w:color="CCCCCC"/>
+            </w:tcBorders>
+            <w:shd w:val="clear" w:color="auto" w:fill="F2F2F2"/>
+            <w:tcMar>
+              <w:top w:w="80" w:type="dxa"/>
+              <w:left w:w="120" w:type="dxa"/>
+              <w:bottom w:w="80" w:type="dxa"/>
+              <w:right w:w="120" w:type="dxa"/>
+            </w:tcMar>
+          </w:tcPr>
+          <w:p>
+            <w:pPr>
+              <w:rPr>
+                <w:sz w:val="18"/>
+                <w:szCs w:val="18"/>
+              </w:rPr>
+            </w:pPr>
+            <w:r>
+              <w:rPr>
+                <w:sz w:val="18"/>
+                <w:szCs w:val="18"/>
+              </w:rPr>
+              <w:t>VARCHAR(10)</w:t>
+            </w:r>
+          </w:p>
+        </w:tc>
+        <w:tc>
+          <w:tcPr>
+            <w:tcW w:w="639" w:type="dxa"/>
+            <w:tcBorders>
+              <w:top w:val="single" w:sz="1" w:space="0" w:color="CCCCCC"/>
+              <w:left w:val="single" w:sz="1" w:space="0" w:color="CCCCCC"/>
+              <w:bottom w:val="single" w:sz="1" w:space="0" w:color="CCCCCC"/>
+              <w:right w:val="single" w:sz="1" w:space="0" w:color="CCCCCC"/>
+            </w:tcBorders>
+            <w:shd w:val="clear" w:color="auto" w:fill="F2F2F2"/>
+            <w:tcMar>
+              <w:top w:w="80" w:type="dxa"/>
+              <w:left w:w="120" w:type="dxa"/>
+              <w:bottom w:w="80" w:type="dxa"/>
+              <w:right w:w="120" w:type="dxa"/>
+            </w:tcMar>
+          </w:tcPr>
+          <w:p>
+            <w:pPr>
+              <w:rPr>
+                <w:sz w:val="18"/>
+                <w:szCs w:val="18"/>
+              </w:rPr>
+            </w:pPr>
+            <w:r>
+              <w:rPr>
+                <w:sz w:val="18"/>
+                <w:szCs w:val="18"/>
+              </w:rPr>
+              <w:t>Si</w:t>
+            </w:r>
+          </w:p>
+        </w:tc>
+        <w:tc>
+          <w:tcPr>
+            <w:tcW w:w="1711" w:type="dxa"/>
+            <w:tcBorders>
+              <w:top w:val="single" w:sz="1" w:space="0" w:color="CCCCCC"/>
+              <w:left w:val="single" w:sz="1" w:space="0" w:color="CCCCCC"/>
+              <w:bottom w:val="single" w:sz="1" w:space="0" w:color="CCCCCC"/>
+              <w:right w:val="single" w:sz="1" w:space="0" w:color="CCCCCC"/>
+            </w:tcBorders>
+            <w:shd w:val="clear" w:color="auto" w:fill="F2F2F2"/>
+            <w:tcMar>
+              <w:top w:w="80" w:type="dxa"/>
+              <w:left w:w="120" w:type="dxa"/>
+              <w:bottom w:w="80" w:type="dxa"/>
+              <w:right w:w="120" w:type="dxa"/>
+            </w:tcMar>
+          </w:tcPr>
+          <w:p>
+            <w:pPr>
+              <w:rPr>
+                <w:sz w:val="18"/>
+                <w:szCs w:val="18"/>
+              </w:rPr>
+            </w:pPr>
+            <w:r>
+              <w:rPr>
+                <w:sz w:val="18"/>
+                <w:szCs w:val="18"/>
+              </w:rPr>
+              <w:t>—</w:t>
+            </w:r>
+          </w:p>
+        </w:tc>
+        <w:tc>
+          <w:tcPr>
+            <w:tcW w:w="3404" w:type="dxa"/>
+            <w:tcBorders>
+              <w:top w:val="single" w:sz="1" w:space="0" w:color="CCCCCC"/>
+              <w:left w:val="single" w:sz="1" w:space="0" w:color="CCCCCC"/>
+              <w:bottom w:val="single" w:sz="1" w:space="0" w:color="CCCCCC"/>
+              <w:right w:val="single" w:sz="1" w:space="0" w:color="CCCCCC"/>
+            </w:tcBorders>
+            <w:shd w:val="clear" w:color="auto" w:fill="F2F2F2"/>
+            <w:tcMar>
+              <w:top w:w="80" w:type="dxa"/>
+              <w:left w:w="120" w:type="dxa"/>
+              <w:bottom w:w="80" w:type="dxa"/>
+              <w:right w:w="120" w:type="dxa"/>
+            </w:tcMar>
+          </w:tcPr>
+          <w:p>
+            <w:pPr>
+              <w:rPr>
+                <w:sz w:val="18"/>
+                <w:szCs w:val="18"/>
+              </w:rPr>
+            </w:pPr>
+            <w:r>
+              <w:rPr>
+                <w:sz w:val="18"/>
+                <w:szCs w:val="18"/>
+              </w:rPr>
+              <w:t>Codice della categoria (es. ID.AM)</w:t>
+            </w:r>
+          </w:p>
+        </w:tc>
+      </w:tr>
+      <w:tr>
+        <w:tc>
+          <w:tcPr>
+            <w:tcW w:w="1731" w:type="dxa"/>
+            <w:tcBorders>
+              <w:top w:val="single" w:sz="1" w:space="0" w:color="CCCCCC"/>
+              <w:left w:val="single" w:sz="1" w:space="0" w:color="CCCCCC"/>
+              <w:bottom w:val="single" w:sz="1" w:space="0" w:color="CCCCCC"/>
+              <w:right w:val="single" w:sz="1" w:space="0" w:color="CCCCCC"/>
+            </w:tcBorders>
+            <w:tcMar>
+              <w:top w:w="80" w:type="dxa"/>
+              <w:left w:w="120" w:type="dxa"/>
+              <w:bottom w:w="80" w:type="dxa"/>
+              <w:right w:w="120" w:type="dxa"/>
+            </w:tcMar>
+          </w:tcPr>
+          <w:p>
+            <w:pPr>
+              <w:rPr>
+                <w:sz w:val="18"/>
+                <w:szCs w:val="18"/>
+              </w:rPr>
+            </w:pPr>
+            <w:r>
+              <w:rPr>
+                <w:sz w:val="18"/>
+                <w:szCs w:val="18"/>
+              </w:rPr>
+              <w:t>categoria_nome</w:t>
+            </w:r>
+          </w:p>
+        </w:tc>
+        <w:tc>
+          <w:tcPr>
+            <w:tcW w:w="1541" w:type="dxa"/>
+            <w:tcBorders>
+              <w:top w:val="single" w:sz="1" w:space="0" w:color="CCCCCC"/>
+              <w:left w:val="single" w:sz="1" w:space="0" w:color="CCCCCC"/>
+              <w:bottom w:val="single" w:sz="1" w:space="0" w:color="CCCCCC"/>
+              <w:right w:val="single" w:sz="1" w:space="0" w:color="CCCCCC"/>
+            </w:tcBorders>
+            <w:tcMar>
+              <w:top w:w="80" w:type="dxa"/>
+              <w:left w:w="120" w:type="dxa"/>
+              <w:bottom w:w="80" w:type="dxa"/>
+              <w:right w:w="120" w:type="dxa"/>
+            </w:tcMar>
+          </w:tcPr>
+          <w:p>
+            <w:pPr>
+              <w:rPr>
+                <w:sz w:val="18"/>
+                <w:szCs w:val="18"/>
+              </w:rPr>
+            </w:pPr>
+            <w:r>
+              <w:rPr>
+                <w:sz w:val="18"/>
+                <w:szCs w:val="18"/>
+              </w:rPr>
+              <w:t>VARCHAR(120)</w:t>
+            </w:r>
+          </w:p>
+        </w:tc>
+        <w:tc>
+          <w:tcPr>
+            <w:tcW w:w="639" w:type="dxa"/>
+            <w:tcBorders>
+              <w:top w:val="single" w:sz="1" w:space="0" w:color="CCCCCC"/>
+              <w:left w:val="single" w:sz="1" w:space="0" w:color="CCCCCC"/>
+              <w:bottom w:val="single" w:sz="1" w:space="0" w:color="CCCCCC"/>
+              <w:right w:val="single" w:sz="1" w:space="0" w:color="CCCCCC"/>
+            </w:tcBorders>
+            <w:tcMar>
+              <w:top w:w="80" w:type="dxa"/>
+              <w:left w:w="120" w:type="dxa"/>
+              <w:bottom w:w="80" w:type="dxa"/>
+              <w:right w:w="120" w:type="dxa"/>
+            </w:tcMar>
+          </w:tcPr>
+          <w:p>
+            <w:pPr>
+              <w:rPr>
+                <w:sz w:val="18"/>
+                <w:szCs w:val="18"/>
+              </w:rPr>
+            </w:pPr>
+            <w:r>
+              <w:rPr>
+                <w:sz w:val="18"/>
+                <w:szCs w:val="18"/>
+              </w:rPr>
+              <w:t>Si</w:t>
+            </w:r>
+          </w:p>
+        </w:tc>
+        <w:tc>
+          <w:tcPr>
+            <w:tcW w:w="1711" w:type="dxa"/>
+            <w:tcBorders>
+              <w:top w:val="single" w:sz="1" w:space="0" w:color="CCCCCC"/>
+              <w:left w:val="single" w:sz="1" w:space="0" w:color="CCCCCC"/>
+              <w:bottom w:val="single" w:sz="1" w:space="0" w:color="CCCCCC"/>
+              <w:right w:val="single" w:sz="1" w:space="0" w:color="CCCCCC"/>
+            </w:tcBorders>
+            <w:tcMar>
+              <w:top w:w="80" w:type="dxa"/>
+              <w:left w:w="120" w:type="dxa"/>
+              <w:bottom w:w="80" w:type="dxa"/>
+              <w:right w:w="120" w:type="dxa"/>
+            </w:tcMar>
+          </w:tcPr>
+          <w:p>
+            <w:pPr>
+              <w:rPr>
+                <w:sz w:val="18"/>
+                <w:szCs w:val="18"/>
+              </w:rPr>
+            </w:pPr>
+            <w:r>
+              <w:rPr>
+                <w:sz w:val="18"/>
+                <w:szCs w:val="18"/>
+              </w:rPr>
+              <w:t>—</w:t>
+            </w:r>
+          </w:p>
+        </w:tc>
+        <w:tc>
+          <w:tcPr>
+            <w:tcW w:w="3404" w:type="dxa"/>
+            <w:tcBorders>
+              <w:top w:val="single" w:sz="1" w:space="0" w:color="CCCCCC"/>
+              <w:left w:val="single" w:sz="1" w:space="0" w:color="CCCCCC"/>
+              <w:bottom w:val="single" w:sz="1" w:space="0" w:color="CCCCCC"/>
+              <w:right w:val="single" w:sz="1" w:space="0" w:color="CCCCCC"/>
+            </w:tcBorders>
+            <w:tcMar>
+              <w:top w:w="80" w:type="dxa"/>
+              <w:left w:w="120" w:type="dxa"/>
+              <w:bottom w:w="80" w:type="dxa"/>
+              <w:right w:w="120" w:type="dxa"/>
+            </w:tcMar>
+          </w:tcPr>
+          <w:p>
+            <w:pPr>
+              <w:rPr>
+                <w:sz w:val="18"/>
+                <w:szCs w:val="18"/>
+              </w:rPr>
+            </w:pPr>
+            <w:r>
+              <w:rPr>
+                <w:sz w:val="18"/>
+                <w:szCs w:val="18"/>
+              </w:rPr>
+              <w:t>Nome esteso della categoria</w:t>
+            </w:r>
+          </w:p>
+        </w:tc>
+      </w:tr>
+      <w:tr>
+        <w:tc>
+          <w:tcPr>
+            <w:tcW w:w="1731" w:type="dxa"/>
+            <w:tcBorders>
+              <w:top w:val="single" w:sz="1" w:space="0" w:color="CCCCCC"/>
+              <w:left w:val="single" w:sz="1" w:space="0" w:color="CCCCCC"/>
+              <w:bottom w:val="single" w:sz="1" w:space="0" w:color="CCCCCC"/>
+              <w:right w:val="single" w:sz="1" w:space="0" w:color="CCCCCC"/>
+            </w:tcBorders>
+            <w:shd w:val="clear" w:color="auto" w:fill="F2F2F2"/>
+            <w:tcMar>
+              <w:top w:w="80" w:type="dxa"/>
+              <w:left w:w="120" w:type="dxa"/>
+              <w:bottom w:w="80" w:type="dxa"/>
+              <w:right w:w="120" w:type="dxa"/>
+            </w:tcMar>
+          </w:tcPr>
+          <w:p>
+            <w:pPr>
+              <w:rPr>
+                <w:sz w:val="18"/>
+                <w:szCs w:val="18"/>
+              </w:rPr>
+            </w:pPr>
+            <w:r>
+              <w:rPr>
+                <w:sz w:val="18"/>
+                <w:szCs w:val="18"/>
+              </w:rPr>
+              <w:t>descrizione</w:t>
+            </w:r>
+          </w:p>
+        </w:tc>
+        <w:tc>
+          <w:tcPr>
+            <w:tcW w:w="1541" w:type="dxa"/>
+            <w:tcBorders>
+              <w:top w:val="single" w:sz="1" w:space="0" w:color="CCCCCC"/>
+              <w:left w:val="single" w:sz="1" w:space="0" w:color="CCCCCC"/>
+              <w:bottom w:val="single" w:sz="1" w:space="0" w:color="CCCCCC"/>
+              <w:right w:val="single" w:sz="1" w:space="0" w:color="CCCCCC"/>
+            </w:tcBorders>
+            <w:shd w:val="clear" w:color="auto" w:fill="F2F2F2"/>
+            <w:tcMar>
+              <w:top w:w="80" w:type="dxa"/>
+              <w:left w:w="120" w:type="dxa"/>
+              <w:bottom w:w="80" w:type="dxa"/>
+              <w:right w:w="120" w:type="dxa"/>
+            </w:tcMar>
+          </w:tcPr>
+          <w:p>
+            <w:pPr>
+              <w:rPr>
+                <w:sz w:val="18"/>
+                <w:szCs w:val="18"/>
+              </w:rPr>
+            </w:pPr>
+            <w:r>
+              <w:rPr>
+                <w:sz w:val="18"/>
+                <w:szCs w:val="18"/>
+              </w:rPr>
+              <w:t>TEXT</w:t>
+            </w:r>
+          </w:p>
+        </w:tc>
+        <w:tc>
+          <w:tcPr>
+            <w:tcW w:w="639" w:type="dxa"/>
+            <w:tcBorders>
+              <w:top w:val="single" w:sz="1" w:space="0" w:color="CCCCCC"/>
+              <w:left w:val="single" w:sz="1" w:space="0" w:color="CCCCCC"/>
+              <w:bottom w:val="single" w:sz="1" w:space="0" w:color="CCCCCC"/>
+              <w:right w:val="single" w:sz="1" w:space="0" w:color="CCCCCC"/>
+            </w:tcBorders>
+            <w:shd w:val="clear" w:color="auto" w:fill="F2F2F2"/>
+            <w:tcMar>
+              <w:top w:w="80" w:type="dxa"/>
+              <w:left w:w="120" w:type="dxa"/>
+              <w:bottom w:w="80" w:type="dxa"/>
+              <w:right w:w="120" w:type="dxa"/>
+            </w:tcMar>
+          </w:tcPr>
+          <w:p>
+            <w:pPr>
+              <w:rPr>
+                <w:sz w:val="18"/>
+                <w:szCs w:val="18"/>
+              </w:rPr>
+            </w:pPr>
+            <w:r>
+              <w:rPr>
+                <w:sz w:val="18"/>
+                <w:szCs w:val="18"/>
+              </w:rPr>
+              <w:t>Si</w:t>
+            </w:r>
+          </w:p>
+        </w:tc>
+        <w:tc>
+          <w:tcPr>
+            <w:tcW w:w="1711" w:type="dxa"/>
+            <w:tcBorders>
+              <w:top w:val="single" w:sz="1" w:space="0" w:color="CCCCCC"/>
+              <w:left w:val="single" w:sz="1" w:space="0" w:color="CCCCCC"/>
+              <w:bottom w:val="single" w:sz="1" w:space="0" w:color="CCCCCC"/>
+              <w:right w:val="single" w:sz="1" w:space="0" w:color="CCCCCC"/>
+            </w:tcBorders>
+            <w:shd w:val="clear" w:color="auto" w:fill="F2F2F2"/>
+            <w:tcMar>
+              <w:top w:w="80" w:type="dxa"/>
+              <w:left w:w="120" w:type="dxa"/>
+              <w:bottom w:w="80" w:type="dxa"/>
+              <w:right w:w="120" w:type="dxa"/>
+            </w:tcMar>
+          </w:tcPr>
+          <w:p>
+            <w:pPr>
+              <w:rPr>
+                <w:sz w:val="18"/>
+                <w:szCs w:val="18"/>
+              </w:rPr>
+            </w:pPr>
+            <w:r>
+              <w:rPr>
+                <w:sz w:val="18"/>
+                <w:szCs w:val="18"/>
+              </w:rPr>
+              <w:t>—</w:t>
+            </w:r>
+          </w:p>
+        </w:tc>
+        <w:tc>
+          <w:tcPr>
+            <w:tcW w:w="3404" w:type="dxa"/>
+            <w:tcBorders>
+              <w:top w:val="single" w:sz="1" w:space="0" w:color="CCCCCC"/>
+              <w:left w:val="single" w:sz="1" w:space="0" w:color="CCCCCC"/>
+              <w:bottom w:val="single" w:sz="1" w:space="0" w:color="CCCCCC"/>
+              <w:right w:val="single" w:sz="1" w:space="0" w:color="CCCCCC"/>
+            </w:tcBorders>
+            <w:shd w:val="clear" w:color="auto" w:fill="F2F2F2"/>
+            <w:tcMar>
+              <w:top w:w="80" w:type="dxa"/>
+              <w:left w:w="120" w:type="dxa"/>
+              <w:bottom w:w="80" w:type="dxa"/>
+              <w:right w:w="120" w:type="dxa"/>
+            </w:tcMar>
+          </w:tcPr>
+          <w:p>
+            <w:pPr>
+              <w:rPr>
+                <w:sz w:val="18"/>
+                <w:szCs w:val="18"/>
+              </w:rPr>
+            </w:pPr>
+            <w:r>
+              <w:rPr>
+                <w:sz w:val="18"/>
+                <w:szCs w:val="18"/>
+              </w:rPr>
+              <w:t>Testo ufficiale della Subcategory</w:t>
+            </w:r>
+          </w:p>
+        </w:tc>
+      </w:tr>
+    </w:tbl>
+    <w:p>
+      <w:pPr>
+        <w:spacing w:after="160"/>
+      </w:pPr>
+    </w:p>
+    <w:p>
+      <w:pPr>
+        <w:pStyle w:val="Heading2"/>
+      </w:pPr>
+      <w:r>
+        <w:rPr>
+          <w:rFonts w:ascii="Arial" w:eastAsia="Arial" w:hAnsi="Arial" w:cs="Arial"/>
+          <w:b/>
+          <w:bCs/>
+          <w:color w:val="2E75B6"/>
+          <w:sz w:val="26"/>
+          <w:szCs w:val="26"/>
+        </w:rPr>
+        <w:t>4.</w:t>
+      </w:r>
+      <w:r>
+        <w:rPr>
+          <w:rFonts w:ascii="Arial" w:eastAsia="Arial" w:hAnsi="Arial" w:cs="Arial"/>
+          <w:b/>
+          <w:bCs/>
+          <w:color w:val="2E75B6"/>
+          <w:sz w:val="26"/>
+          <w:szCs w:val="26"/>
+        </w:rPr>
+        <w:t>3</w:t>
+      </w:r>
+      <w:r>
+        <w:rPr>
+          <w:rFonts w:ascii="Arial" w:eastAsia="Arial" w:hAnsi="Arial" w:cs="Arial"/>
+          <w:b/>
+          <w:bCs/>
+          <w:color w:val="2E75B6"/>
+          <w:sz w:val="26"/>
+          <w:szCs w:val="26"/>
+        </w:rPr>
+        <w:t xml:space="preserve">  organizzazione</w:t>
       </w:r>
     </w:p>
     <w:p>
@@ -3594,6 +4848,7 @@
                 <w:sz w:val="18"/>
                 <w:szCs w:val="18"/>
               </w:rPr>
+              <w:lastRenderedPageBreak/>
               <w:t>settore_nis2</w:t>
             </w:r>
           </w:p>
@@ -4670,7 +5925,6 @@
                 <w:sz w:val="18"/>
                 <w:szCs w:val="18"/>
               </w:rPr>
-              <w:lastRenderedPageBreak/>
               <w:t>updated_at</w:t>
             </w:r>
           </w:p>
@@ -4803,7 +6057,29 @@
           <w:sz w:val="26"/>
           <w:szCs w:val="26"/>
         </w:rPr>
-        <w:t>4.3  sede</w:t>
+        <w:t>4.</w:t>
+      </w:r>
+      <w:r>
+        <w:rPr>
+          <w:rFonts w:ascii="Arial" w:eastAsia="Arial" w:hAnsi="Arial" w:cs="Arial"/>
+          <w:b/>
+          <w:bCs/>
+          <w:color w:val="2E75B6"/>
+          <w:sz w:val="26"/>
+          <w:szCs w:val="26"/>
+        </w:rPr>
+        <w:t>4</w:t>
+      </w:r>
+      <w:r>
+        <w:rPr>
+          <w:rFonts w:ascii="Arial" w:eastAsia="Arial" w:hAnsi="Arial" w:cs="Arial"/>
+          <w:b/>
+          <w:bCs/>
+          <w:color w:val="2E75B6"/>
+          <w:sz w:val="26"/>
+          <w:szCs w:val="26"/>
+        </w:rPr>
+        <w:t xml:space="preserve">  sede</w:t>
       </w:r>
     </w:p>
     <w:p>
@@ -6221,7 +7497,29 @@
           <w:szCs w:val="26"/>
         </w:rPr>
         <w:lastRenderedPageBreak/>
-        <w:t>4.4  asset</w:t>
+        <w:t>4.</w:t>
+      </w:r>
+      <w:r>
+        <w:rPr>
+          <w:rFonts w:ascii="Arial" w:eastAsia="Arial" w:hAnsi="Arial" w:cs="Arial"/>
+          <w:b/>
+          <w:bCs/>
+          <w:color w:val="2E75B6"/>
+          <w:sz w:val="26"/>
+          <w:szCs w:val="26"/>
+        </w:rPr>
+        <w:t>5</w:t>
+      </w:r>
+      <w:r>
+        <w:rPr>
+          <w:rFonts w:ascii="Arial" w:eastAsia="Arial" w:hAnsi="Arial" w:cs="Arial"/>
+          <w:b/>
+          <w:bCs/>
+          <w:color w:val="2E75B6"/>
+          <w:sz w:val="26"/>
+          <w:szCs w:val="26"/>
+        </w:rPr>
+        <w:t xml:space="preserve">  asset</w:t>
       </w:r>
     </w:p>
     <w:p>
@@ -8469,7 +9767,29 @@
           <w:szCs w:val="26"/>
         </w:rPr>
         <w:lastRenderedPageBreak/>
-        <w:t>4.5  asset_storico</w:t>
+        <w:t>4.</w:t>
+      </w:r>
+      <w:r>
+        <w:rPr>
+          <w:rFonts w:ascii="Arial" w:eastAsia="Arial" w:hAnsi="Arial" w:cs="Arial"/>
+          <w:b/>
+          <w:bCs/>
+          <w:color w:val="2E75B6"/>
+          <w:sz w:val="26"/>
+          <w:szCs w:val="26"/>
+        </w:rPr>
+        <w:t>6</w:t>
+      </w:r>
+      <w:r>
+        <w:rPr>
+          <w:rFonts w:ascii="Arial" w:eastAsia="Arial" w:hAnsi="Arial" w:cs="Arial"/>
+          <w:b/>
+          <w:bCs/>
+          <w:color w:val="2E75B6"/>
+          <w:sz w:val="26"/>
+          <w:szCs w:val="26"/>
+        </w:rPr>
+        <w:t xml:space="preserve">  asset_storico</w:t>
       </w:r>
     </w:p>
     <w:p>
@@ -9772,7 +11092,29 @@
           <w:szCs w:val="26"/>
         </w:rPr>
         <w:lastRenderedPageBreak/>
-        <w:t>4.6  servizio</w:t>
+        <w:t>4.</w:t>
+      </w:r>
+      <w:r>
+        <w:rPr>
+          <w:rFonts w:ascii="Arial" w:eastAsia="Arial" w:hAnsi="Arial" w:cs="Arial"/>
+          <w:b/>
+          <w:bCs/>
+          <w:color w:val="2E75B6"/>
+          <w:sz w:val="26"/>
+          <w:szCs w:val="26"/>
+        </w:rPr>
+        <w:t>7</w:t>
+      </w:r>
+      <w:r>
+        <w:rPr>
+          <w:rFonts w:ascii="Arial" w:eastAsia="Arial" w:hAnsi="Arial" w:cs="Arial"/>
+          <w:b/>
+          <w:bCs/>
+          <w:color w:val="2E75B6"/>
+          <w:sz w:val="26"/>
+          <w:szCs w:val="26"/>
+        </w:rPr>
+        <w:t xml:space="preserve">  servizio</w:t>
       </w:r>
     </w:p>
     <w:p>
@@ -11596,7 +12938,29 @@
           <w:szCs w:val="26"/>
         </w:rPr>
         <w:lastRenderedPageBreak/>
-        <w:t>4.7  asset_servizio</w:t>
+        <w:t>4.</w:t>
+      </w:r>
+      <w:r>
+        <w:rPr>
+          <w:rFonts w:ascii="Arial" w:eastAsia="Arial" w:hAnsi="Arial" w:cs="Arial"/>
+          <w:b/>
+          <w:bCs/>
+          <w:color w:val="2E75B6"/>
+          <w:sz w:val="26"/>
+          <w:szCs w:val="26"/>
+        </w:rPr>
+        <w:t>8</w:t>
+      </w:r>
+      <w:r>
+        <w:rPr>
+          <w:rFonts w:ascii="Arial" w:eastAsia="Arial" w:hAnsi="Arial" w:cs="Arial"/>
+          <w:b/>
+          <w:bCs/>
+          <w:color w:val="2E75B6"/>
+          <w:sz w:val="26"/>
+          <w:szCs w:val="26"/>
+        </w:rPr>
+        <w:t xml:space="preserve">  asset_servizio</w:t>
       </w:r>
     </w:p>
     <w:p>
@@ -12607,7 +13971,29 @@
           <w:sz w:val="26"/>
           <w:szCs w:val="26"/>
         </w:rPr>
-        <w:t>4.8  fornitore</w:t>
+        <w:t>4.</w:t>
+      </w:r>
+      <w:r>
+        <w:rPr>
+          <w:rFonts w:ascii="Arial" w:eastAsia="Arial" w:hAnsi="Arial" w:cs="Arial"/>
+          <w:b/>
+          <w:bCs/>
+          <w:color w:val="2E75B6"/>
+          <w:sz w:val="26"/>
+          <w:szCs w:val="26"/>
+        </w:rPr>
+        <w:t>9</w:t>
+      </w:r>
+      <w:r>
+        <w:rPr>
+          <w:rFonts w:ascii="Arial" w:eastAsia="Arial" w:hAnsi="Arial" w:cs="Arial"/>
+          <w:b/>
+          <w:bCs/>
+          <w:color w:val="2E75B6"/>
+          <w:sz w:val="26"/>
+          <w:szCs w:val="26"/>
+        </w:rPr>
+        <w:t xml:space="preserve">  fornitore</w:t>
       </w:r>
     </w:p>
     <w:p>
@@ -14019,7 +15405,29 @@
           <w:sz w:val="26"/>
           <w:szCs w:val="26"/>
         </w:rPr>
-        <w:t>4.9  contratto</w:t>
+        <w:t>4.</w:t>
+      </w:r>
+      <w:r>
+        <w:rPr>
+          <w:rFonts w:ascii="Arial" w:eastAsia="Arial" w:hAnsi="Arial" w:cs="Arial"/>
+          <w:b/>
+          <w:bCs/>
+          <w:color w:val="2E75B6"/>
+          <w:sz w:val="26"/>
+          <w:szCs w:val="26"/>
+        </w:rPr>
+        <w:t>10</w:t>
+      </w:r>
+      <w:r>
+        <w:rPr>
+          <w:rFonts w:ascii="Arial" w:eastAsia="Arial" w:hAnsi="Arial" w:cs="Arial"/>
+          <w:b/>
+          <w:bCs/>
+          <w:color w:val="2E75B6"/>
+          <w:sz w:val="26"/>
+          <w:szCs w:val="26"/>
+        </w:rPr>
+        <w:t xml:space="preserve">  contratto</w:t>
       </w:r>
     </w:p>
     <w:p>
@@ -15706,7 +17114,29 @@
           <w:szCs w:val="26"/>
         </w:rPr>
         <w:lastRenderedPageBreak/>
-        <w:t>4.10  dipendenza</w:t>
+        <w:t>4.1</w:t>
+      </w:r>
+      <w:r>
+        <w:rPr>
+          <w:rFonts w:ascii="Arial" w:eastAsia="Arial" w:hAnsi="Arial" w:cs="Arial"/>
+          <w:b/>
+          <w:bCs/>
+          <w:color w:val="2E75B6"/>
+          <w:sz w:val="26"/>
+          <w:szCs w:val="26"/>
+        </w:rPr>
+        <w:t>1</w:t>
+      </w:r>
+      <w:r>
+        <w:rPr>
+          <w:rFonts w:ascii="Arial" w:eastAsia="Arial" w:hAnsi="Arial" w:cs="Arial"/>
+          <w:b/>
+          <w:bCs/>
+          <w:color w:val="2E75B6"/>
+          <w:sz w:val="26"/>
+          <w:szCs w:val="26"/>
+        </w:rPr>
+        <w:t xml:space="preserve">  dipendenza</w:t>
       </w:r>
     </w:p>
     <w:p>
@@ -17560,7 +18990,29 @@
           <w:sz w:val="26"/>
           <w:szCs w:val="26"/>
         </w:rPr>
-        <w:t>4.11  persona</w:t>
+        <w:t>4.1</w:t>
+      </w:r>
+      <w:r>
+        <w:rPr>
+          <w:rFonts w:ascii="Arial" w:eastAsia="Arial" w:hAnsi="Arial" w:cs="Arial"/>
+          <w:b/>
+          <w:bCs/>
+          <w:color w:val="2E75B6"/>
+          <w:sz w:val="26"/>
+          <w:szCs w:val="26"/>
+        </w:rPr>
+        <w:t>2</w:t>
+      </w:r>
+      <w:r>
+        <w:rPr>
+          <w:rFonts w:ascii="Arial" w:eastAsia="Arial" w:hAnsi="Arial" w:cs="Arial"/>
+          <w:b/>
+          <w:bCs/>
+          <w:color w:val="2E75B6"/>
+          <w:sz w:val="26"/>
+          <w:szCs w:val="26"/>
+        </w:rPr>
+        <w:t xml:space="preserve">  persona</w:t>
       </w:r>
     </w:p>
     <w:p>
@@ -19125,7 +20577,29 @@
           <w:sz w:val="26"/>
           <w:szCs w:val="26"/>
         </w:rPr>
-        <w:t>4.12  responsabilita</w:t>
+        <w:t>4.1</w:t>
+      </w:r>
+      <w:r>
+        <w:rPr>
+          <w:rFonts w:ascii="Arial" w:eastAsia="Arial" w:hAnsi="Arial" w:cs="Arial"/>
+          <w:b/>
+          <w:bCs/>
+          <w:color w:val="2E75B6"/>
+          <w:sz w:val="26"/>
+          <w:szCs w:val="26"/>
+        </w:rPr>
+        <w:t>3</w:t>
+      </w:r>
+      <w:r>
+        <w:rPr>
+          <w:rFonts w:ascii="Arial" w:eastAsia="Arial" w:hAnsi="Arial" w:cs="Arial"/>
+          <w:b/>
+          <w:bCs/>
+          <w:color w:val="2E75B6"/>
+          <w:sz w:val="26"/>
+          <w:szCs w:val="26"/>
+        </w:rPr>
+        <w:t xml:space="preserve">  responsabilita</w:t>
       </w:r>
     </w:p>
     <w:p>
@@ -20433,7 +21907,29 @@
           <w:szCs w:val="26"/>
         </w:rPr>
         <w:lastRenderedPageBreak/>
-        <w:t>4.13  misura_sicurezza</w:t>
+        <w:t>4.1</w:t>
+      </w:r>
+      <w:r>
+        <w:rPr>
+          <w:rFonts w:ascii="Arial" w:eastAsia="Arial" w:hAnsi="Arial" w:cs="Arial"/>
+          <w:b/>
+          <w:bCs/>
+          <w:color w:val="2E75B6"/>
+          <w:sz w:val="26"/>
+          <w:szCs w:val="26"/>
+        </w:rPr>
+        <w:t>4</w:t>
+      </w:r>
+      <w:r>
+        <w:rPr>
+          <w:rFonts w:ascii="Arial" w:eastAsia="Arial" w:hAnsi="Arial" w:cs="Arial"/>
+          <w:b/>
+          <w:bCs/>
+          <w:color w:val="2E75B6"/>
+          <w:sz w:val="26"/>
+          <w:szCs w:val="26"/>
+        </w:rPr>
+        <w:t xml:space="preserve">  misura_sicurezza</w:t>
       </w:r>
     </w:p>
     <w:p>
@@ -22302,7 +23798,29 @@
           <w:sz w:val="26"/>
           <w:szCs w:val="26"/>
         </w:rPr>
-        <w:t>4.14  profilo_acn</w:t>
+        <w:t>4.1</w:t>
+      </w:r>
+      <w:r>
+        <w:rPr>
+          <w:rFonts w:ascii="Arial" w:eastAsia="Arial" w:hAnsi="Arial" w:cs="Arial"/>
+          <w:b/>
+          <w:bCs/>
+          <w:color w:val="2E75B6"/>
+          <w:sz w:val="26"/>
+          <w:szCs w:val="26"/>
+        </w:rPr>
+        <w:t>5</w:t>
+      </w:r>
+      <w:r>
+        <w:rPr>
+          <w:rFonts w:ascii="Arial" w:eastAsia="Arial" w:hAnsi="Arial" w:cs="Arial"/>
+          <w:b/>
+          <w:bCs/>
+          <w:color w:val="2E75B6"/>
+          <w:sz w:val="26"/>
+          <w:szCs w:val="26"/>
+        </w:rPr>
+        <w:t xml:space="preserve">  profilo_acn</w:t>
       </w:r>
     </w:p>
     <w:p>
@@ -23435,13 +24953,1749 @@
       </w:tr>
     </w:tbl>
     <w:p>
+      <w:r>
+        <w:t xml:space="preserve"> </w:t>
+      </w:r>
+    </w:p>
+    <w:p>
       <w:pPr>
-        <w:spacing w:after="160"/>
+        <w:pStyle w:val="Heading2"/>
+        <w:rPr>
+          <w:rFonts w:ascii="Arial" w:eastAsia="Arial" w:hAnsi="Arial" w:cs="Arial"/>
+          <w:b/>
+          <w:bCs/>
+          <w:color w:val="2E75B6"/>
+          <w:sz w:val="26"/>
+          <w:szCs w:val="26"/>
+        </w:rPr>
+      </w:pPr>
+      <w:r>
+        <w:rPr>
+          <w:rFonts w:ascii="Arial" w:eastAsia="Arial" w:hAnsi="Arial" w:cs="Arial"/>
+          <w:b/>
+          <w:bCs/>
+          <w:color w:val="2E75B6"/>
+          <w:sz w:val="26"/>
+          <w:szCs w:val="26"/>
+        </w:rPr>
+        <w:t>4.16  assessment</w:t>
+      </w:r>
+    </w:p>
+    <w:p>
+      <w:pPr>
+        <w:spacing w:after="240"/>
+        <w:jc w:val="both"/>
+      </w:pPr>
+      <w:r>
+        <w:t>Valutazione per Subcategory: profilo target (livello desiderato) e profilo attuale (livello rilevato), con priorita', maturita' e data della valutazione.</w:t>
+      </w:r>
+    </w:p>
+    <w:tbl>
+      <w:tblPr>
+        <w:tblpPr w:leftFromText="141" w:rightFromText="141" w:vertAnchor="text" w:horzAnchor="margin" w:tblpY="11"/>
+        <w:tblW w:w="9075" w:type="dxa"/>
+        <w:tblBorders>
+          <w:top w:val="single" w:sz="4" w:space="0" w:color="auto"/>
+          <w:left w:val="single" w:sz="4" w:space="0" w:color="auto"/>
+          <w:bottom w:val="single" w:sz="4" w:space="0" w:color="auto"/>
+          <w:right w:val="single" w:sz="4" w:space="0" w:color="auto"/>
+          <w:insideH w:val="single" w:sz="4" w:space="0" w:color="auto"/>
+          <w:insideV w:val="single" w:sz="4" w:space="0" w:color="auto"/>
+        </w:tblBorders>
+        <w:tblCellMar>
+          <w:left w:w="10" w:type="dxa"/>
+          <w:right w:w="10" w:type="dxa"/>
+        </w:tblCellMar>
+        <w:tblLook w:val="04A0" w:firstRow="1" w:lastRow="0" w:firstColumn="1" w:lastColumn="0" w:noHBand="0" w:noVBand="1"/>
+      </w:tblPr>
+      <w:tblGrid>
+        <w:gridCol w:w="1692"/>
+        <w:gridCol w:w="1574"/>
+        <w:gridCol w:w="631"/>
+        <w:gridCol w:w="3423"/>
+        <w:gridCol w:w="1755"/>
+      </w:tblGrid>
+      <w:tr>
+        <w:trPr>
+          <w:tblHeader/>
+        </w:trPr>
+        <w:tc>
+          <w:tcPr>
+            <w:tcW w:w="1692" w:type="dxa"/>
+            <w:tcBorders>
+              <w:top w:val="single" w:sz="1" w:space="0" w:color="CCCCCC"/>
+              <w:left w:val="single" w:sz="1" w:space="0" w:color="CCCCCC"/>
+              <w:bottom w:val="single" w:sz="1" w:space="0" w:color="CCCCCC"/>
+              <w:right w:val="single" w:sz="1" w:space="0" w:color="CCCCCC"/>
+            </w:tcBorders>
+            <w:shd w:val="clear" w:color="auto" w:fill="D5E8F0"/>
+            <w:tcMar>
+              <w:top w:w="80" w:type="dxa"/>
+              <w:left w:w="120" w:type="dxa"/>
+              <w:bottom w:w="80" w:type="dxa"/>
+              <w:right w:w="120" w:type="dxa"/>
+            </w:tcMar>
+          </w:tcPr>
+          <w:p>
+            <w:pPr>
+              <w:rPr>
+                <w:b/>
+                <w:bCs/>
+                <w:sz w:val="18"/>
+                <w:szCs w:val="18"/>
+              </w:rPr>
+            </w:pPr>
+            <w:r>
+              <w:rPr>
+                <w:b/>
+                <w:bCs/>
+                <w:sz w:val="18"/>
+                <w:szCs w:val="18"/>
+              </w:rPr>
+              <w:t>Campo</w:t>
+            </w:r>
+          </w:p>
+        </w:tc>
+        <w:tc>
+          <w:tcPr>
+            <w:tcW w:w="1574" w:type="dxa"/>
+            <w:tcBorders>
+              <w:top w:val="single" w:sz="1" w:space="0" w:color="CCCCCC"/>
+              <w:left w:val="single" w:sz="1" w:space="0" w:color="CCCCCC"/>
+              <w:bottom w:val="single" w:sz="1" w:space="0" w:color="CCCCCC"/>
+              <w:right w:val="single" w:sz="1" w:space="0" w:color="CCCCCC"/>
+            </w:tcBorders>
+            <w:shd w:val="clear" w:color="auto" w:fill="D5E8F0"/>
+            <w:tcMar>
+              <w:top w:w="80" w:type="dxa"/>
+              <w:left w:w="120" w:type="dxa"/>
+              <w:bottom w:w="80" w:type="dxa"/>
+              <w:right w:w="120" w:type="dxa"/>
+            </w:tcMar>
+          </w:tcPr>
+          <w:p>
+            <w:pPr>
+              <w:rPr>
+                <w:b/>
+                <w:bCs/>
+                <w:sz w:val="18"/>
+                <w:szCs w:val="18"/>
+              </w:rPr>
+            </w:pPr>
+            <w:r>
+              <w:rPr>
+                <w:b/>
+                <w:bCs/>
+                <w:sz w:val="18"/>
+                <w:szCs w:val="18"/>
+              </w:rPr>
+              <w:t>Tipo PostgreSQL</w:t>
+            </w:r>
+          </w:p>
+        </w:tc>
+        <w:tc>
+          <w:tcPr>
+            <w:tcW w:w="631" w:type="dxa"/>
+            <w:tcBorders>
+              <w:top w:val="single" w:sz="1" w:space="0" w:color="CCCCCC"/>
+              <w:left w:val="single" w:sz="1" w:space="0" w:color="CCCCCC"/>
+              <w:bottom w:val="single" w:sz="1" w:space="0" w:color="CCCCCC"/>
+              <w:right w:val="single" w:sz="1" w:space="0" w:color="CCCCCC"/>
+            </w:tcBorders>
+            <w:shd w:val="clear" w:color="auto" w:fill="D5E8F0"/>
+            <w:tcMar>
+              <w:top w:w="80" w:type="dxa"/>
+              <w:left w:w="120" w:type="dxa"/>
+              <w:bottom w:w="80" w:type="dxa"/>
+              <w:right w:w="120" w:type="dxa"/>
+            </w:tcMar>
+          </w:tcPr>
+          <w:p>
+            <w:pPr>
+              <w:rPr>
+                <w:b/>
+                <w:bCs/>
+                <w:sz w:val="18"/>
+                <w:szCs w:val="18"/>
+              </w:rPr>
+            </w:pPr>
+            <w:r>
+              <w:rPr>
+                <w:b/>
+                <w:bCs/>
+                <w:sz w:val="18"/>
+                <w:szCs w:val="18"/>
+              </w:rPr>
+              <w:t>Req.</w:t>
+            </w:r>
+          </w:p>
+        </w:tc>
+        <w:tc>
+          <w:tcPr>
+            <w:tcW w:w="3423" w:type="dxa"/>
+            <w:tcBorders>
+              <w:top w:val="single" w:sz="1" w:space="0" w:color="CCCCCC"/>
+              <w:left w:val="single" w:sz="1" w:space="0" w:color="CCCCCC"/>
+              <w:bottom w:val="single" w:sz="1" w:space="0" w:color="CCCCCC"/>
+              <w:right w:val="single" w:sz="1" w:space="0" w:color="CCCCCC"/>
+            </w:tcBorders>
+            <w:shd w:val="clear" w:color="auto" w:fill="D5E8F0"/>
+            <w:tcMar>
+              <w:top w:w="80" w:type="dxa"/>
+              <w:left w:w="120" w:type="dxa"/>
+              <w:bottom w:w="80" w:type="dxa"/>
+              <w:right w:w="120" w:type="dxa"/>
+            </w:tcMar>
+          </w:tcPr>
+          <w:p>
+            <w:pPr>
+              <w:rPr>
+                <w:b/>
+                <w:bCs/>
+                <w:sz w:val="18"/>
+                <w:szCs w:val="18"/>
+              </w:rPr>
+            </w:pPr>
+            <w:r>
+              <w:rPr>
+                <w:b/>
+                <w:bCs/>
+                <w:sz w:val="18"/>
+                <w:szCs w:val="18"/>
+              </w:rPr>
+              <w:t>Vincoli / Default</w:t>
+            </w:r>
+          </w:p>
+        </w:tc>
+        <w:tc>
+          <w:tcPr>
+            <w:tcW w:w="1755" w:type="dxa"/>
+            <w:tcBorders>
+              <w:top w:val="single" w:sz="1" w:space="0" w:color="CCCCCC"/>
+              <w:left w:val="single" w:sz="1" w:space="0" w:color="CCCCCC"/>
+              <w:bottom w:val="single" w:sz="1" w:space="0" w:color="CCCCCC"/>
+              <w:right w:val="single" w:sz="1" w:space="0" w:color="CCCCCC"/>
+            </w:tcBorders>
+            <w:shd w:val="clear" w:color="auto" w:fill="D5E8F0"/>
+            <w:tcMar>
+              <w:top w:w="80" w:type="dxa"/>
+              <w:left w:w="120" w:type="dxa"/>
+              <w:bottom w:w="80" w:type="dxa"/>
+              <w:right w:w="120" w:type="dxa"/>
+            </w:tcMar>
+          </w:tcPr>
+          <w:p>
+            <w:pPr>
+              <w:rPr>
+                <w:b/>
+                <w:bCs/>
+                <w:sz w:val="18"/>
+                <w:szCs w:val="18"/>
+              </w:rPr>
+            </w:pPr>
+            <w:r>
+              <w:rPr>
+                <w:b/>
+                <w:bCs/>
+                <w:sz w:val="18"/>
+                <w:szCs w:val="18"/>
+              </w:rPr>
+              <w:t>Descrizione</w:t>
+            </w:r>
+          </w:p>
+        </w:tc>
+      </w:tr>
+      <w:tr>
+        <w:tc>
+          <w:tcPr>
+            <w:tcW w:w="1692" w:type="dxa"/>
+            <w:tcBorders>
+              <w:top w:val="single" w:sz="1" w:space="0" w:color="CCCCCC"/>
+              <w:left w:val="single" w:sz="1" w:space="0" w:color="CCCCCC"/>
+              <w:bottom w:val="single" w:sz="1" w:space="0" w:color="CCCCCC"/>
+              <w:right w:val="single" w:sz="1" w:space="0" w:color="CCCCCC"/>
+            </w:tcBorders>
+            <w:tcMar>
+              <w:top w:w="80" w:type="dxa"/>
+              <w:left w:w="120" w:type="dxa"/>
+              <w:bottom w:w="80" w:type="dxa"/>
+              <w:right w:w="120" w:type="dxa"/>
+            </w:tcMar>
+          </w:tcPr>
+          <w:p>
+            <w:pPr>
+              <w:rPr>
+                <w:sz w:val="18"/>
+                <w:szCs w:val="18"/>
+              </w:rPr>
+            </w:pPr>
+            <w:r>
+              <w:rPr>
+                <w:sz w:val="18"/>
+                <w:szCs w:val="18"/>
+              </w:rPr>
+              <w:t>id</w:t>
+            </w:r>
+          </w:p>
+        </w:tc>
+        <w:tc>
+          <w:tcPr>
+            <w:tcW w:w="1574" w:type="dxa"/>
+            <w:tcBorders>
+              <w:top w:val="single" w:sz="1" w:space="0" w:color="CCCCCC"/>
+              <w:left w:val="single" w:sz="1" w:space="0" w:color="CCCCCC"/>
+              <w:bottom w:val="single" w:sz="1" w:space="0" w:color="CCCCCC"/>
+              <w:right w:val="single" w:sz="1" w:space="0" w:color="CCCCCC"/>
+            </w:tcBorders>
+            <w:tcMar>
+              <w:top w:w="80" w:type="dxa"/>
+              <w:left w:w="120" w:type="dxa"/>
+              <w:bottom w:w="80" w:type="dxa"/>
+              <w:right w:w="120" w:type="dxa"/>
+            </w:tcMar>
+          </w:tcPr>
+          <w:p>
+            <w:pPr>
+              <w:rPr>
+                <w:sz w:val="18"/>
+                <w:szCs w:val="18"/>
+              </w:rPr>
+            </w:pPr>
+            <w:r>
+              <w:rPr>
+                <w:sz w:val="18"/>
+                <w:szCs w:val="18"/>
+              </w:rPr>
+              <w:t>SERIAL</w:t>
+            </w:r>
+          </w:p>
+        </w:tc>
+        <w:tc>
+          <w:tcPr>
+            <w:tcW w:w="631" w:type="dxa"/>
+            <w:tcBorders>
+              <w:top w:val="single" w:sz="1" w:space="0" w:color="CCCCCC"/>
+              <w:left w:val="single" w:sz="1" w:space="0" w:color="CCCCCC"/>
+              <w:bottom w:val="single" w:sz="1" w:space="0" w:color="CCCCCC"/>
+              <w:right w:val="single" w:sz="1" w:space="0" w:color="CCCCCC"/>
+            </w:tcBorders>
+            <w:tcMar>
+              <w:top w:w="80" w:type="dxa"/>
+              <w:left w:w="120" w:type="dxa"/>
+              <w:bottom w:w="80" w:type="dxa"/>
+              <w:right w:w="120" w:type="dxa"/>
+            </w:tcMar>
+          </w:tcPr>
+          <w:p>
+            <w:pPr>
+              <w:rPr>
+                <w:sz w:val="18"/>
+                <w:szCs w:val="18"/>
+              </w:rPr>
+            </w:pPr>
+            <w:r>
+              <w:rPr>
+                <w:sz w:val="18"/>
+                <w:szCs w:val="18"/>
+              </w:rPr>
+              <w:t>Si</w:t>
+            </w:r>
+          </w:p>
+        </w:tc>
+        <w:tc>
+          <w:tcPr>
+            <w:tcW w:w="3423" w:type="dxa"/>
+            <w:tcBorders>
+              <w:top w:val="single" w:sz="1" w:space="0" w:color="CCCCCC"/>
+              <w:left w:val="single" w:sz="1" w:space="0" w:color="CCCCCC"/>
+              <w:bottom w:val="single" w:sz="1" w:space="0" w:color="CCCCCC"/>
+              <w:right w:val="single" w:sz="1" w:space="0" w:color="CCCCCC"/>
+            </w:tcBorders>
+            <w:tcMar>
+              <w:top w:w="80" w:type="dxa"/>
+              <w:left w:w="120" w:type="dxa"/>
+              <w:bottom w:w="80" w:type="dxa"/>
+              <w:right w:w="120" w:type="dxa"/>
+            </w:tcMar>
+          </w:tcPr>
+          <w:p>
+            <w:pPr>
+              <w:rPr>
+                <w:sz w:val="18"/>
+                <w:szCs w:val="18"/>
+              </w:rPr>
+            </w:pPr>
+            <w:r>
+              <w:rPr>
+                <w:sz w:val="18"/>
+                <w:szCs w:val="18"/>
+              </w:rPr>
+              <w:t>PRIMARY KEY</w:t>
+            </w:r>
+          </w:p>
+        </w:tc>
+        <w:tc>
+          <w:tcPr>
+            <w:tcW w:w="1755" w:type="dxa"/>
+            <w:tcBorders>
+              <w:top w:val="single" w:sz="1" w:space="0" w:color="CCCCCC"/>
+              <w:left w:val="single" w:sz="1" w:space="0" w:color="CCCCCC"/>
+              <w:bottom w:val="single" w:sz="1" w:space="0" w:color="CCCCCC"/>
+              <w:right w:val="single" w:sz="1" w:space="0" w:color="CCCCCC"/>
+            </w:tcBorders>
+            <w:tcMar>
+              <w:top w:w="80" w:type="dxa"/>
+              <w:left w:w="120" w:type="dxa"/>
+              <w:bottom w:w="80" w:type="dxa"/>
+              <w:right w:w="120" w:type="dxa"/>
+            </w:tcMar>
+          </w:tcPr>
+          <w:p>
+            <w:pPr>
+              <w:rPr>
+                <w:sz w:val="18"/>
+                <w:szCs w:val="18"/>
+              </w:rPr>
+            </w:pPr>
+            <w:r>
+              <w:rPr>
+                <w:sz w:val="18"/>
+                <w:szCs w:val="18"/>
+              </w:rPr>
+              <w:t>Identificativo della valutazione</w:t>
+            </w:r>
+          </w:p>
+        </w:tc>
+      </w:tr>
+      <w:tr>
+        <w:tc>
+          <w:tcPr>
+            <w:tcW w:w="1692" w:type="dxa"/>
+            <w:tcBorders>
+              <w:top w:val="single" w:sz="1" w:space="0" w:color="CCCCCC"/>
+              <w:left w:val="single" w:sz="1" w:space="0" w:color="CCCCCC"/>
+              <w:bottom w:val="single" w:sz="1" w:space="0" w:color="CCCCCC"/>
+              <w:right w:val="single" w:sz="1" w:space="0" w:color="CCCCCC"/>
+            </w:tcBorders>
+            <w:shd w:val="clear" w:color="auto" w:fill="F2F2F2"/>
+            <w:tcMar>
+              <w:top w:w="80" w:type="dxa"/>
+              <w:left w:w="120" w:type="dxa"/>
+              <w:bottom w:w="80" w:type="dxa"/>
+              <w:right w:w="120" w:type="dxa"/>
+            </w:tcMar>
+          </w:tcPr>
+          <w:p>
+            <w:pPr>
+              <w:rPr>
+                <w:sz w:val="18"/>
+                <w:szCs w:val="18"/>
+              </w:rPr>
+            </w:pPr>
+            <w:r>
+              <w:rPr>
+                <w:sz w:val="18"/>
+                <w:szCs w:val="18"/>
+              </w:rPr>
+              <w:t>organizzazione_id</w:t>
+            </w:r>
+          </w:p>
+        </w:tc>
+        <w:tc>
+          <w:tcPr>
+            <w:tcW w:w="1574" w:type="dxa"/>
+            <w:tcBorders>
+              <w:top w:val="single" w:sz="1" w:space="0" w:color="CCCCCC"/>
+              <w:left w:val="single" w:sz="1" w:space="0" w:color="CCCCCC"/>
+              <w:bottom w:val="single" w:sz="1" w:space="0" w:color="CCCCCC"/>
+              <w:right w:val="single" w:sz="1" w:space="0" w:color="CCCCCC"/>
+            </w:tcBorders>
+            <w:shd w:val="clear" w:color="auto" w:fill="F2F2F2"/>
+            <w:tcMar>
+              <w:top w:w="80" w:type="dxa"/>
+              <w:left w:w="120" w:type="dxa"/>
+              <w:bottom w:w="80" w:type="dxa"/>
+              <w:right w:w="120" w:type="dxa"/>
+            </w:tcMar>
+          </w:tcPr>
+          <w:p>
+            <w:pPr>
+              <w:rPr>
+                <w:sz w:val="18"/>
+                <w:szCs w:val="18"/>
+              </w:rPr>
+            </w:pPr>
+            <w:r>
+              <w:rPr>
+                <w:sz w:val="18"/>
+                <w:szCs w:val="18"/>
+              </w:rPr>
+              <w:t>INT</w:t>
+            </w:r>
+          </w:p>
+        </w:tc>
+        <w:tc>
+          <w:tcPr>
+            <w:tcW w:w="631" w:type="dxa"/>
+            <w:tcBorders>
+              <w:top w:val="single" w:sz="1" w:space="0" w:color="CCCCCC"/>
+              <w:left w:val="single" w:sz="1" w:space="0" w:color="CCCCCC"/>
+              <w:bottom w:val="single" w:sz="1" w:space="0" w:color="CCCCCC"/>
+              <w:right w:val="single" w:sz="1" w:space="0" w:color="CCCCCC"/>
+            </w:tcBorders>
+            <w:shd w:val="clear" w:color="auto" w:fill="F2F2F2"/>
+            <w:tcMar>
+              <w:top w:w="80" w:type="dxa"/>
+              <w:left w:w="120" w:type="dxa"/>
+              <w:bottom w:w="80" w:type="dxa"/>
+              <w:right w:w="120" w:type="dxa"/>
+            </w:tcMar>
+          </w:tcPr>
+          <w:p>
+            <w:pPr>
+              <w:rPr>
+                <w:sz w:val="18"/>
+                <w:szCs w:val="18"/>
+              </w:rPr>
+            </w:pPr>
+            <w:r>
+              <w:rPr>
+                <w:sz w:val="18"/>
+                <w:szCs w:val="18"/>
+              </w:rPr>
+              <w:t>Si</w:t>
+            </w:r>
+          </w:p>
+        </w:tc>
+        <w:tc>
+          <w:tcPr>
+            <w:tcW w:w="3423" w:type="dxa"/>
+            <w:tcBorders>
+              <w:top w:val="single" w:sz="1" w:space="0" w:color="CCCCCC"/>
+              <w:left w:val="single" w:sz="1" w:space="0" w:color="CCCCCC"/>
+              <w:bottom w:val="single" w:sz="1" w:space="0" w:color="CCCCCC"/>
+              <w:right w:val="single" w:sz="1" w:space="0" w:color="CCCCCC"/>
+            </w:tcBorders>
+            <w:shd w:val="clear" w:color="auto" w:fill="F2F2F2"/>
+            <w:tcMar>
+              <w:top w:w="80" w:type="dxa"/>
+              <w:left w:w="120" w:type="dxa"/>
+              <w:bottom w:w="80" w:type="dxa"/>
+              <w:right w:w="120" w:type="dxa"/>
+            </w:tcMar>
+          </w:tcPr>
+          <w:p>
+            <w:pPr>
+              <w:rPr>
+                <w:sz w:val="18"/>
+                <w:szCs w:val="18"/>
+              </w:rPr>
+            </w:pPr>
+            <w:r>
+              <w:rPr>
+                <w:sz w:val="18"/>
+                <w:szCs w:val="18"/>
+              </w:rPr>
+              <w:t>FK organizzazione; ON DELETE CASCADE</w:t>
+            </w:r>
+          </w:p>
+        </w:tc>
+        <w:tc>
+          <w:tcPr>
+            <w:tcW w:w="1755" w:type="dxa"/>
+            <w:tcBorders>
+              <w:top w:val="single" w:sz="1" w:space="0" w:color="CCCCCC"/>
+              <w:left w:val="single" w:sz="1" w:space="0" w:color="CCCCCC"/>
+              <w:bottom w:val="single" w:sz="1" w:space="0" w:color="CCCCCC"/>
+              <w:right w:val="single" w:sz="1" w:space="0" w:color="CCCCCC"/>
+            </w:tcBorders>
+            <w:shd w:val="clear" w:color="auto" w:fill="F2F2F2"/>
+            <w:tcMar>
+              <w:top w:w="80" w:type="dxa"/>
+              <w:left w:w="120" w:type="dxa"/>
+              <w:bottom w:w="80" w:type="dxa"/>
+              <w:right w:w="120" w:type="dxa"/>
+            </w:tcMar>
+          </w:tcPr>
+          <w:p>
+            <w:pPr>
+              <w:rPr>
+                <w:sz w:val="18"/>
+                <w:szCs w:val="18"/>
+              </w:rPr>
+            </w:pPr>
+            <w:r>
+              <w:rPr>
+                <w:sz w:val="18"/>
+                <w:szCs w:val="18"/>
+              </w:rPr>
+              <w:t>Organizzazione valutata</w:t>
+            </w:r>
+          </w:p>
+        </w:tc>
+      </w:tr>
+      <w:tr>
+        <w:tc>
+          <w:tcPr>
+            <w:tcW w:w="1692" w:type="dxa"/>
+            <w:tcBorders>
+              <w:top w:val="single" w:sz="1" w:space="0" w:color="CCCCCC"/>
+              <w:left w:val="single" w:sz="1" w:space="0" w:color="CCCCCC"/>
+              <w:bottom w:val="single" w:sz="1" w:space="0" w:color="CCCCCC"/>
+              <w:right w:val="single" w:sz="1" w:space="0" w:color="CCCCCC"/>
+            </w:tcBorders>
+            <w:tcMar>
+              <w:top w:w="80" w:type="dxa"/>
+              <w:left w:w="120" w:type="dxa"/>
+              <w:bottom w:w="80" w:type="dxa"/>
+              <w:right w:w="120" w:type="dxa"/>
+            </w:tcMar>
+          </w:tcPr>
+          <w:p>
+            <w:pPr>
+              <w:rPr>
+                <w:sz w:val="18"/>
+                <w:szCs w:val="18"/>
+              </w:rPr>
+            </w:pPr>
+            <w:r>
+              <w:rPr>
+                <w:sz w:val="18"/>
+                <w:szCs w:val="18"/>
+              </w:rPr>
+              <w:t>subcategory_cod</w:t>
+            </w:r>
+          </w:p>
+        </w:tc>
+        <w:tc>
+          <w:tcPr>
+            <w:tcW w:w="1574" w:type="dxa"/>
+            <w:tcBorders>
+              <w:top w:val="single" w:sz="1" w:space="0" w:color="CCCCCC"/>
+              <w:left w:val="single" w:sz="1" w:space="0" w:color="CCCCCC"/>
+              <w:bottom w:val="single" w:sz="1" w:space="0" w:color="CCCCCC"/>
+              <w:right w:val="single" w:sz="1" w:space="0" w:color="CCCCCC"/>
+            </w:tcBorders>
+            <w:tcMar>
+              <w:top w:w="80" w:type="dxa"/>
+              <w:left w:w="120" w:type="dxa"/>
+              <w:bottom w:w="80" w:type="dxa"/>
+              <w:right w:w="120" w:type="dxa"/>
+            </w:tcMar>
+          </w:tcPr>
+          <w:p>
+            <w:pPr>
+              <w:rPr>
+                <w:sz w:val="18"/>
+                <w:szCs w:val="18"/>
+              </w:rPr>
+            </w:pPr>
+            <w:r>
+              <w:rPr>
+                <w:sz w:val="18"/>
+                <w:szCs w:val="18"/>
+              </w:rPr>
+              <w:t>VARCHAR(15)</w:t>
+            </w:r>
+          </w:p>
+        </w:tc>
+        <w:tc>
+          <w:tcPr>
+            <w:tcW w:w="631" w:type="dxa"/>
+            <w:tcBorders>
+              <w:top w:val="single" w:sz="1" w:space="0" w:color="CCCCCC"/>
+              <w:left w:val="single" w:sz="1" w:space="0" w:color="CCCCCC"/>
+              <w:bottom w:val="single" w:sz="1" w:space="0" w:color="CCCCCC"/>
+              <w:right w:val="single" w:sz="1" w:space="0" w:color="CCCCCC"/>
+            </w:tcBorders>
+            <w:tcMar>
+              <w:top w:w="80" w:type="dxa"/>
+              <w:left w:w="120" w:type="dxa"/>
+              <w:bottom w:w="80" w:type="dxa"/>
+              <w:right w:w="120" w:type="dxa"/>
+            </w:tcMar>
+          </w:tcPr>
+          <w:p>
+            <w:pPr>
+              <w:rPr>
+                <w:sz w:val="18"/>
+                <w:szCs w:val="18"/>
+              </w:rPr>
+            </w:pPr>
+            <w:r>
+              <w:rPr>
+                <w:sz w:val="18"/>
+                <w:szCs w:val="18"/>
+              </w:rPr>
+              <w:t>Si</w:t>
+            </w:r>
+          </w:p>
+        </w:tc>
+        <w:tc>
+          <w:tcPr>
+            <w:tcW w:w="3423" w:type="dxa"/>
+            <w:tcBorders>
+              <w:top w:val="single" w:sz="1" w:space="0" w:color="CCCCCC"/>
+              <w:left w:val="single" w:sz="1" w:space="0" w:color="CCCCCC"/>
+              <w:bottom w:val="single" w:sz="1" w:space="0" w:color="CCCCCC"/>
+              <w:right w:val="single" w:sz="1" w:space="0" w:color="CCCCCC"/>
+            </w:tcBorders>
+            <w:tcMar>
+              <w:top w:w="80" w:type="dxa"/>
+              <w:left w:w="120" w:type="dxa"/>
+              <w:bottom w:w="80" w:type="dxa"/>
+              <w:right w:w="120" w:type="dxa"/>
+            </w:tcMar>
+          </w:tcPr>
+          <w:p>
+            <w:pPr>
+              <w:rPr>
+                <w:sz w:val="18"/>
+                <w:szCs w:val="18"/>
+                <w:lang w:val="en-US"/>
+              </w:rPr>
+            </w:pPr>
+            <w:r>
+              <w:rPr>
+                <w:sz w:val="18"/>
+                <w:szCs w:val="18"/>
+              </w:rPr>
+              <w:t>FK framework_subcategory</w:t>
+            </w:r>
+          </w:p>
+        </w:tc>
+        <w:tc>
+          <w:tcPr>
+            <w:tcW w:w="1755" w:type="dxa"/>
+            <w:tcBorders>
+              <w:top w:val="single" w:sz="1" w:space="0" w:color="CCCCCC"/>
+              <w:left w:val="single" w:sz="1" w:space="0" w:color="CCCCCC"/>
+              <w:bottom w:val="single" w:sz="1" w:space="0" w:color="CCCCCC"/>
+              <w:right w:val="single" w:sz="1" w:space="0" w:color="CCCCCC"/>
+            </w:tcBorders>
+            <w:tcMar>
+              <w:top w:w="80" w:type="dxa"/>
+              <w:left w:w="120" w:type="dxa"/>
+              <w:bottom w:w="80" w:type="dxa"/>
+              <w:right w:w="120" w:type="dxa"/>
+            </w:tcMar>
+          </w:tcPr>
+          <w:p>
+            <w:pPr>
+              <w:rPr>
+                <w:sz w:val="18"/>
+                <w:szCs w:val="18"/>
+              </w:rPr>
+            </w:pPr>
+            <w:r>
+              <w:rPr>
+                <w:sz w:val="18"/>
+                <w:szCs w:val="18"/>
+              </w:rPr>
+              <w:t>Subcategory valutata</w:t>
+            </w:r>
+          </w:p>
+        </w:tc>
+      </w:tr>
+      <w:tr>
+        <w:tc>
+          <w:tcPr>
+            <w:tcW w:w="1692" w:type="dxa"/>
+            <w:tcBorders>
+              <w:top w:val="single" w:sz="1" w:space="0" w:color="CCCCCC"/>
+              <w:left w:val="single" w:sz="1" w:space="0" w:color="CCCCCC"/>
+              <w:bottom w:val="single" w:sz="1" w:space="0" w:color="CCCCCC"/>
+              <w:right w:val="single" w:sz="1" w:space="0" w:color="CCCCCC"/>
+            </w:tcBorders>
+            <w:shd w:val="clear" w:color="auto" w:fill="F2F2F2"/>
+            <w:tcMar>
+              <w:top w:w="80" w:type="dxa"/>
+              <w:left w:w="120" w:type="dxa"/>
+              <w:bottom w:w="80" w:type="dxa"/>
+              <w:right w:w="120" w:type="dxa"/>
+            </w:tcMar>
+          </w:tcPr>
+          <w:p>
+            <w:pPr>
+              <w:rPr>
+                <w:sz w:val="18"/>
+                <w:szCs w:val="18"/>
+              </w:rPr>
+            </w:pPr>
+            <w:r>
+              <w:rPr>
+                <w:sz w:val="18"/>
+                <w:szCs w:val="18"/>
+              </w:rPr>
+              <w:t>priorita</w:t>
+            </w:r>
+          </w:p>
+        </w:tc>
+        <w:tc>
+          <w:tcPr>
+            <w:tcW w:w="1574" w:type="dxa"/>
+            <w:tcBorders>
+              <w:top w:val="single" w:sz="1" w:space="0" w:color="CCCCCC"/>
+              <w:left w:val="single" w:sz="1" w:space="0" w:color="CCCCCC"/>
+              <w:bottom w:val="single" w:sz="1" w:space="0" w:color="CCCCCC"/>
+              <w:right w:val="single" w:sz="1" w:space="0" w:color="CCCCCC"/>
+            </w:tcBorders>
+            <w:shd w:val="clear" w:color="auto" w:fill="F2F2F2"/>
+            <w:tcMar>
+              <w:top w:w="80" w:type="dxa"/>
+              <w:left w:w="120" w:type="dxa"/>
+              <w:bottom w:w="80" w:type="dxa"/>
+              <w:right w:w="120" w:type="dxa"/>
+            </w:tcMar>
+          </w:tcPr>
+          <w:p>
+            <w:pPr>
+              <w:rPr>
+                <w:sz w:val="18"/>
+                <w:szCs w:val="18"/>
+              </w:rPr>
+            </w:pPr>
+            <w:r>
+              <w:rPr>
+                <w:sz w:val="18"/>
+                <w:szCs w:val="18"/>
+              </w:rPr>
+              <w:t>VARCHAR(6)</w:t>
+            </w:r>
+          </w:p>
+        </w:tc>
+        <w:tc>
+          <w:tcPr>
+            <w:tcW w:w="631" w:type="dxa"/>
+            <w:tcBorders>
+              <w:top w:val="single" w:sz="1" w:space="0" w:color="CCCCCC"/>
+              <w:left w:val="single" w:sz="1" w:space="0" w:color="CCCCCC"/>
+              <w:bottom w:val="single" w:sz="1" w:space="0" w:color="CCCCCC"/>
+              <w:right w:val="single" w:sz="1" w:space="0" w:color="CCCCCC"/>
+            </w:tcBorders>
+            <w:shd w:val="clear" w:color="auto" w:fill="F2F2F2"/>
+            <w:tcMar>
+              <w:top w:w="80" w:type="dxa"/>
+              <w:left w:w="120" w:type="dxa"/>
+              <w:bottom w:w="80" w:type="dxa"/>
+              <w:right w:w="120" w:type="dxa"/>
+            </w:tcMar>
+          </w:tcPr>
+          <w:p>
+            <w:pPr>
+              <w:rPr>
+                <w:sz w:val="18"/>
+                <w:szCs w:val="18"/>
+              </w:rPr>
+            </w:pPr>
+            <w:r>
+              <w:rPr>
+                <w:sz w:val="18"/>
+                <w:szCs w:val="18"/>
+              </w:rPr>
+              <w:t>Si</w:t>
+            </w:r>
+          </w:p>
+        </w:tc>
+        <w:tc>
+          <w:tcPr>
+            <w:tcW w:w="3423" w:type="dxa"/>
+            <w:tcBorders>
+              <w:top w:val="single" w:sz="1" w:space="0" w:color="CCCCCC"/>
+              <w:left w:val="single" w:sz="1" w:space="0" w:color="CCCCCC"/>
+              <w:bottom w:val="single" w:sz="1" w:space="0" w:color="CCCCCC"/>
+              <w:right w:val="single" w:sz="1" w:space="0" w:color="CCCCCC"/>
+            </w:tcBorders>
+            <w:shd w:val="clear" w:color="auto" w:fill="F2F2F2"/>
+            <w:tcMar>
+              <w:top w:w="80" w:type="dxa"/>
+              <w:left w:w="120" w:type="dxa"/>
+              <w:bottom w:w="80" w:type="dxa"/>
+              <w:right w:w="120" w:type="dxa"/>
+            </w:tcMar>
+          </w:tcPr>
+          <w:p>
+            <w:pPr>
+              <w:rPr>
+                <w:sz w:val="18"/>
+                <w:szCs w:val="18"/>
+              </w:rPr>
+            </w:pPr>
+            <w:r>
+              <w:rPr>
+                <w:sz w:val="18"/>
+                <w:szCs w:val="18"/>
+              </w:rPr>
+              <w:t>CHECK (alta, media, bassa); DEFAULT 'media'</w:t>
+            </w:r>
+          </w:p>
+        </w:tc>
+        <w:tc>
+          <w:tcPr>
+            <w:tcW w:w="1755" w:type="dxa"/>
+            <w:tcBorders>
+              <w:top w:val="single" w:sz="1" w:space="0" w:color="CCCCCC"/>
+              <w:left w:val="single" w:sz="1" w:space="0" w:color="CCCCCC"/>
+              <w:bottom w:val="single" w:sz="1" w:space="0" w:color="CCCCCC"/>
+              <w:right w:val="single" w:sz="1" w:space="0" w:color="CCCCCC"/>
+            </w:tcBorders>
+            <w:shd w:val="clear" w:color="auto" w:fill="F2F2F2"/>
+            <w:tcMar>
+              <w:top w:w="80" w:type="dxa"/>
+              <w:left w:w="120" w:type="dxa"/>
+              <w:bottom w:w="80" w:type="dxa"/>
+              <w:right w:w="120" w:type="dxa"/>
+            </w:tcMar>
+          </w:tcPr>
+          <w:p>
+            <w:pPr>
+              <w:rPr>
+                <w:sz w:val="18"/>
+                <w:szCs w:val="18"/>
+              </w:rPr>
+            </w:pPr>
+            <w:r>
+              <w:rPr>
+                <w:sz w:val="18"/>
+                <w:szCs w:val="18"/>
+              </w:rPr>
+              <w:t>Priorita' nel profilo target</w:t>
+            </w:r>
+          </w:p>
+        </w:tc>
+      </w:tr>
+      <w:tr>
+        <w:tc>
+          <w:tcPr>
+            <w:tcW w:w="1692" w:type="dxa"/>
+            <w:tcBorders>
+              <w:top w:val="single" w:sz="1" w:space="0" w:color="CCCCCC"/>
+              <w:left w:val="single" w:sz="1" w:space="0" w:color="CCCCCC"/>
+              <w:bottom w:val="single" w:sz="1" w:space="0" w:color="CCCCCC"/>
+              <w:right w:val="single" w:sz="1" w:space="0" w:color="CCCCCC"/>
+            </w:tcBorders>
+            <w:tcMar>
+              <w:top w:w="80" w:type="dxa"/>
+              <w:left w:w="120" w:type="dxa"/>
+              <w:bottom w:w="80" w:type="dxa"/>
+              <w:right w:w="120" w:type="dxa"/>
+            </w:tcMar>
+          </w:tcPr>
+          <w:p>
+            <w:pPr>
+              <w:rPr>
+                <w:sz w:val="18"/>
+                <w:szCs w:val="18"/>
+              </w:rPr>
+            </w:pPr>
+            <w:r>
+              <w:rPr>
+                <w:sz w:val="18"/>
+                <w:szCs w:val="18"/>
+              </w:rPr>
+              <w:t>livello_target</w:t>
+            </w:r>
+          </w:p>
+        </w:tc>
+        <w:tc>
+          <w:tcPr>
+            <w:tcW w:w="1574" w:type="dxa"/>
+            <w:tcBorders>
+              <w:top w:val="single" w:sz="1" w:space="0" w:color="CCCCCC"/>
+              <w:left w:val="single" w:sz="1" w:space="0" w:color="CCCCCC"/>
+              <w:bottom w:val="single" w:sz="1" w:space="0" w:color="CCCCCC"/>
+              <w:right w:val="single" w:sz="1" w:space="0" w:color="CCCCCC"/>
+            </w:tcBorders>
+            <w:tcMar>
+              <w:top w:w="80" w:type="dxa"/>
+              <w:left w:w="120" w:type="dxa"/>
+              <w:bottom w:w="80" w:type="dxa"/>
+              <w:right w:w="120" w:type="dxa"/>
+            </w:tcMar>
+          </w:tcPr>
+          <w:p>
+            <w:pPr>
+              <w:rPr>
+                <w:sz w:val="18"/>
+                <w:szCs w:val="18"/>
+              </w:rPr>
+            </w:pPr>
+            <w:r>
+              <w:rPr>
+                <w:sz w:val="18"/>
+                <w:szCs w:val="18"/>
+              </w:rPr>
+              <w:t>SMALLINT</w:t>
+            </w:r>
+          </w:p>
+        </w:tc>
+        <w:tc>
+          <w:tcPr>
+            <w:tcW w:w="631" w:type="dxa"/>
+            <w:tcBorders>
+              <w:top w:val="single" w:sz="1" w:space="0" w:color="CCCCCC"/>
+              <w:left w:val="single" w:sz="1" w:space="0" w:color="CCCCCC"/>
+              <w:bottom w:val="single" w:sz="1" w:space="0" w:color="CCCCCC"/>
+              <w:right w:val="single" w:sz="1" w:space="0" w:color="CCCCCC"/>
+            </w:tcBorders>
+            <w:tcMar>
+              <w:top w:w="80" w:type="dxa"/>
+              <w:left w:w="120" w:type="dxa"/>
+              <w:bottom w:w="80" w:type="dxa"/>
+              <w:right w:w="120" w:type="dxa"/>
+            </w:tcMar>
+          </w:tcPr>
+          <w:p>
+            <w:pPr>
+              <w:rPr>
+                <w:sz w:val="18"/>
+                <w:szCs w:val="18"/>
+              </w:rPr>
+            </w:pPr>
+            <w:r>
+              <w:rPr>
+                <w:sz w:val="18"/>
+                <w:szCs w:val="18"/>
+              </w:rPr>
+              <w:t>Si</w:t>
+            </w:r>
+          </w:p>
+        </w:tc>
+        <w:tc>
+          <w:tcPr>
+            <w:tcW w:w="3423" w:type="dxa"/>
+            <w:tcBorders>
+              <w:top w:val="single" w:sz="1" w:space="0" w:color="CCCCCC"/>
+              <w:left w:val="single" w:sz="1" w:space="0" w:color="CCCCCC"/>
+              <w:bottom w:val="single" w:sz="1" w:space="0" w:color="CCCCCC"/>
+              <w:right w:val="single" w:sz="1" w:space="0" w:color="CCCCCC"/>
+            </w:tcBorders>
+            <w:tcMar>
+              <w:top w:w="80" w:type="dxa"/>
+              <w:left w:w="120" w:type="dxa"/>
+              <w:bottom w:w="80" w:type="dxa"/>
+              <w:right w:w="120" w:type="dxa"/>
+            </w:tcMar>
+          </w:tcPr>
+          <w:p>
+            <w:pPr>
+              <w:rPr>
+                <w:sz w:val="18"/>
+                <w:szCs w:val="18"/>
+              </w:rPr>
+            </w:pPr>
+            <w:r>
+              <w:rPr>
+                <w:sz w:val="18"/>
+                <w:szCs w:val="18"/>
+              </w:rPr>
+              <w:t>CHECK fra 0 e 4</w:t>
+            </w:r>
+          </w:p>
+        </w:tc>
+        <w:tc>
+          <w:tcPr>
+            <w:tcW w:w="1755" w:type="dxa"/>
+            <w:tcBorders>
+              <w:top w:val="single" w:sz="1" w:space="0" w:color="CCCCCC"/>
+              <w:left w:val="single" w:sz="1" w:space="0" w:color="CCCCCC"/>
+              <w:bottom w:val="single" w:sz="1" w:space="0" w:color="CCCCCC"/>
+              <w:right w:val="single" w:sz="1" w:space="0" w:color="CCCCCC"/>
+            </w:tcBorders>
+            <w:tcMar>
+              <w:top w:w="80" w:type="dxa"/>
+              <w:left w:w="120" w:type="dxa"/>
+              <w:bottom w:w="80" w:type="dxa"/>
+              <w:right w:w="120" w:type="dxa"/>
+            </w:tcMar>
+          </w:tcPr>
+          <w:p>
+            <w:pPr>
+              <w:rPr>
+                <w:sz w:val="18"/>
+                <w:szCs w:val="18"/>
+              </w:rPr>
+            </w:pPr>
+            <w:r>
+              <w:rPr>
+                <w:sz w:val="18"/>
+                <w:szCs w:val="18"/>
+              </w:rPr>
+              <w:t>Livello desiderato (profilo target)</w:t>
+            </w:r>
+          </w:p>
+        </w:tc>
+      </w:tr>
+      <w:tr>
+        <w:tc>
+          <w:tcPr>
+            <w:tcW w:w="1692" w:type="dxa"/>
+            <w:tcBorders>
+              <w:top w:val="single" w:sz="1" w:space="0" w:color="CCCCCC"/>
+              <w:left w:val="single" w:sz="1" w:space="0" w:color="CCCCCC"/>
+              <w:bottom w:val="single" w:sz="1" w:space="0" w:color="CCCCCC"/>
+              <w:right w:val="single" w:sz="1" w:space="0" w:color="CCCCCC"/>
+            </w:tcBorders>
+            <w:shd w:val="clear" w:color="auto" w:fill="F2F2F2"/>
+            <w:tcMar>
+              <w:top w:w="80" w:type="dxa"/>
+              <w:left w:w="120" w:type="dxa"/>
+              <w:bottom w:w="80" w:type="dxa"/>
+              <w:right w:w="120" w:type="dxa"/>
+            </w:tcMar>
+          </w:tcPr>
+          <w:p>
+            <w:pPr>
+              <w:rPr>
+                <w:sz w:val="18"/>
+                <w:szCs w:val="18"/>
+              </w:rPr>
+            </w:pPr>
+            <w:r>
+              <w:rPr>
+                <w:sz w:val="18"/>
+                <w:szCs w:val="18"/>
+              </w:rPr>
+              <w:t>livello_attuale</w:t>
+            </w:r>
+          </w:p>
+        </w:tc>
+        <w:tc>
+          <w:tcPr>
+            <w:tcW w:w="1574" w:type="dxa"/>
+            <w:tcBorders>
+              <w:top w:val="single" w:sz="1" w:space="0" w:color="CCCCCC"/>
+              <w:left w:val="single" w:sz="1" w:space="0" w:color="CCCCCC"/>
+              <w:bottom w:val="single" w:sz="1" w:space="0" w:color="CCCCCC"/>
+              <w:right w:val="single" w:sz="1" w:space="0" w:color="CCCCCC"/>
+            </w:tcBorders>
+            <w:shd w:val="clear" w:color="auto" w:fill="F2F2F2"/>
+            <w:tcMar>
+              <w:top w:w="80" w:type="dxa"/>
+              <w:left w:w="120" w:type="dxa"/>
+              <w:bottom w:w="80" w:type="dxa"/>
+              <w:right w:w="120" w:type="dxa"/>
+            </w:tcMar>
+          </w:tcPr>
+          <w:p>
+            <w:pPr>
+              <w:rPr>
+                <w:sz w:val="18"/>
+                <w:szCs w:val="18"/>
+              </w:rPr>
+            </w:pPr>
+            <w:r>
+              <w:rPr>
+                <w:sz w:val="18"/>
+                <w:szCs w:val="18"/>
+              </w:rPr>
+              <w:t>SMALLINT</w:t>
+            </w:r>
+          </w:p>
+        </w:tc>
+        <w:tc>
+          <w:tcPr>
+            <w:tcW w:w="631" w:type="dxa"/>
+            <w:tcBorders>
+              <w:top w:val="single" w:sz="1" w:space="0" w:color="CCCCCC"/>
+              <w:left w:val="single" w:sz="1" w:space="0" w:color="CCCCCC"/>
+              <w:bottom w:val="single" w:sz="1" w:space="0" w:color="CCCCCC"/>
+              <w:right w:val="single" w:sz="1" w:space="0" w:color="CCCCCC"/>
+            </w:tcBorders>
+            <w:shd w:val="clear" w:color="auto" w:fill="F2F2F2"/>
+            <w:tcMar>
+              <w:top w:w="80" w:type="dxa"/>
+              <w:left w:w="120" w:type="dxa"/>
+              <w:bottom w:w="80" w:type="dxa"/>
+              <w:right w:w="120" w:type="dxa"/>
+            </w:tcMar>
+          </w:tcPr>
+          <w:p>
+            <w:pPr>
+              <w:rPr>
+                <w:sz w:val="18"/>
+                <w:szCs w:val="18"/>
+              </w:rPr>
+            </w:pPr>
+            <w:r>
+              <w:rPr>
+                <w:sz w:val="18"/>
+                <w:szCs w:val="18"/>
+              </w:rPr>
+              <w:t>Si</w:t>
+            </w:r>
+          </w:p>
+        </w:tc>
+        <w:tc>
+          <w:tcPr>
+            <w:tcW w:w="3423" w:type="dxa"/>
+            <w:tcBorders>
+              <w:top w:val="single" w:sz="1" w:space="0" w:color="CCCCCC"/>
+              <w:left w:val="single" w:sz="1" w:space="0" w:color="CCCCCC"/>
+              <w:bottom w:val="single" w:sz="1" w:space="0" w:color="CCCCCC"/>
+              <w:right w:val="single" w:sz="1" w:space="0" w:color="CCCCCC"/>
+            </w:tcBorders>
+            <w:shd w:val="clear" w:color="auto" w:fill="F2F2F2"/>
+            <w:tcMar>
+              <w:top w:w="80" w:type="dxa"/>
+              <w:left w:w="120" w:type="dxa"/>
+              <w:bottom w:w="80" w:type="dxa"/>
+              <w:right w:w="120" w:type="dxa"/>
+            </w:tcMar>
+          </w:tcPr>
+          <w:p>
+            <w:pPr>
+              <w:rPr>
+                <w:sz w:val="18"/>
+                <w:szCs w:val="18"/>
+              </w:rPr>
+            </w:pPr>
+            <w:r>
+              <w:rPr>
+                <w:sz w:val="18"/>
+                <w:szCs w:val="18"/>
+              </w:rPr>
+              <w:t>CHECK fra 0 e 4</w:t>
+            </w:r>
+          </w:p>
+        </w:tc>
+        <w:tc>
+          <w:tcPr>
+            <w:tcW w:w="1755" w:type="dxa"/>
+            <w:tcBorders>
+              <w:top w:val="single" w:sz="1" w:space="0" w:color="CCCCCC"/>
+              <w:left w:val="single" w:sz="1" w:space="0" w:color="CCCCCC"/>
+              <w:bottom w:val="single" w:sz="1" w:space="0" w:color="CCCCCC"/>
+              <w:right w:val="single" w:sz="1" w:space="0" w:color="CCCCCC"/>
+            </w:tcBorders>
+            <w:shd w:val="clear" w:color="auto" w:fill="F2F2F2"/>
+            <w:tcMar>
+              <w:top w:w="80" w:type="dxa"/>
+              <w:left w:w="120" w:type="dxa"/>
+              <w:bottom w:w="80" w:type="dxa"/>
+              <w:right w:w="120" w:type="dxa"/>
+            </w:tcMar>
+          </w:tcPr>
+          <w:p>
+            <w:pPr>
+              <w:rPr>
+                <w:sz w:val="18"/>
+                <w:szCs w:val="18"/>
+              </w:rPr>
+            </w:pPr>
+            <w:r>
+              <w:rPr>
+                <w:sz w:val="18"/>
+                <w:szCs w:val="18"/>
+              </w:rPr>
+              <w:t>Livello rilevato (profilo attuale)</w:t>
+            </w:r>
+          </w:p>
+        </w:tc>
+      </w:tr>
+      <w:tr>
+        <w:tc>
+          <w:tcPr>
+            <w:tcW w:w="1692" w:type="dxa"/>
+            <w:tcBorders>
+              <w:top w:val="single" w:sz="1" w:space="0" w:color="CCCCCC"/>
+              <w:left w:val="single" w:sz="1" w:space="0" w:color="CCCCCC"/>
+              <w:bottom w:val="single" w:sz="1" w:space="0" w:color="CCCCCC"/>
+              <w:right w:val="single" w:sz="1" w:space="0" w:color="CCCCCC"/>
+            </w:tcBorders>
+            <w:tcMar>
+              <w:top w:w="80" w:type="dxa"/>
+              <w:left w:w="120" w:type="dxa"/>
+              <w:bottom w:w="80" w:type="dxa"/>
+              <w:right w:w="120" w:type="dxa"/>
+            </w:tcMar>
+          </w:tcPr>
+          <w:p>
+            <w:pPr>
+              <w:rPr>
+                <w:sz w:val="18"/>
+                <w:szCs w:val="18"/>
+              </w:rPr>
+            </w:pPr>
+            <w:r>
+              <w:rPr>
+                <w:sz w:val="18"/>
+                <w:szCs w:val="18"/>
+              </w:rPr>
+              <w:t>livello_maturita</w:t>
+            </w:r>
+          </w:p>
+        </w:tc>
+        <w:tc>
+          <w:tcPr>
+            <w:tcW w:w="1574" w:type="dxa"/>
+            <w:tcBorders>
+              <w:top w:val="single" w:sz="1" w:space="0" w:color="CCCCCC"/>
+              <w:left w:val="single" w:sz="1" w:space="0" w:color="CCCCCC"/>
+              <w:bottom w:val="single" w:sz="1" w:space="0" w:color="CCCCCC"/>
+              <w:right w:val="single" w:sz="1" w:space="0" w:color="CCCCCC"/>
+            </w:tcBorders>
+            <w:tcMar>
+              <w:top w:w="80" w:type="dxa"/>
+              <w:left w:w="120" w:type="dxa"/>
+              <w:bottom w:w="80" w:type="dxa"/>
+              <w:right w:w="120" w:type="dxa"/>
+            </w:tcMar>
+          </w:tcPr>
+          <w:p>
+            <w:pPr>
+              <w:rPr>
+                <w:sz w:val="18"/>
+                <w:szCs w:val="18"/>
+              </w:rPr>
+            </w:pPr>
+            <w:r>
+              <w:rPr>
+                <w:sz w:val="18"/>
+                <w:szCs w:val="18"/>
+              </w:rPr>
+              <w:t>SMALLINT</w:t>
+            </w:r>
+          </w:p>
+        </w:tc>
+        <w:tc>
+          <w:tcPr>
+            <w:tcW w:w="631" w:type="dxa"/>
+            <w:tcBorders>
+              <w:top w:val="single" w:sz="1" w:space="0" w:color="CCCCCC"/>
+              <w:left w:val="single" w:sz="1" w:space="0" w:color="CCCCCC"/>
+              <w:bottom w:val="single" w:sz="1" w:space="0" w:color="CCCCCC"/>
+              <w:right w:val="single" w:sz="1" w:space="0" w:color="CCCCCC"/>
+            </w:tcBorders>
+            <w:tcMar>
+              <w:top w:w="80" w:type="dxa"/>
+              <w:left w:w="120" w:type="dxa"/>
+              <w:bottom w:w="80" w:type="dxa"/>
+              <w:right w:w="120" w:type="dxa"/>
+            </w:tcMar>
+          </w:tcPr>
+          <w:p>
+            <w:pPr>
+              <w:rPr>
+                <w:sz w:val="18"/>
+                <w:szCs w:val="18"/>
+              </w:rPr>
+            </w:pPr>
+            <w:r>
+              <w:rPr>
+                <w:sz w:val="18"/>
+                <w:szCs w:val="18"/>
+              </w:rPr>
+              <w:t>No</w:t>
+            </w:r>
+          </w:p>
+        </w:tc>
+        <w:tc>
+          <w:tcPr>
+            <w:tcW w:w="3423" w:type="dxa"/>
+            <w:tcBorders>
+              <w:top w:val="single" w:sz="1" w:space="0" w:color="CCCCCC"/>
+              <w:left w:val="single" w:sz="1" w:space="0" w:color="CCCCCC"/>
+              <w:bottom w:val="single" w:sz="1" w:space="0" w:color="CCCCCC"/>
+              <w:right w:val="single" w:sz="1" w:space="0" w:color="CCCCCC"/>
+            </w:tcBorders>
+            <w:tcMar>
+              <w:top w:w="80" w:type="dxa"/>
+              <w:left w:w="120" w:type="dxa"/>
+              <w:bottom w:w="80" w:type="dxa"/>
+              <w:right w:w="120" w:type="dxa"/>
+            </w:tcMar>
+          </w:tcPr>
+          <w:p>
+            <w:pPr>
+              <w:rPr>
+                <w:sz w:val="18"/>
+                <w:szCs w:val="18"/>
+              </w:rPr>
+            </w:pPr>
+            <w:r>
+              <w:rPr>
+                <w:sz w:val="18"/>
+                <w:szCs w:val="18"/>
+              </w:rPr>
+              <w:t>CHECK fra 0 e 4</w:t>
+            </w:r>
+          </w:p>
+        </w:tc>
+        <w:tc>
+          <w:tcPr>
+            <w:tcW w:w="1755" w:type="dxa"/>
+            <w:tcBorders>
+              <w:top w:val="single" w:sz="1" w:space="0" w:color="CCCCCC"/>
+              <w:left w:val="single" w:sz="1" w:space="0" w:color="CCCCCC"/>
+              <w:bottom w:val="single" w:sz="1" w:space="0" w:color="CCCCCC"/>
+              <w:right w:val="single" w:sz="1" w:space="0" w:color="CCCCCC"/>
+            </w:tcBorders>
+            <w:tcMar>
+              <w:top w:w="80" w:type="dxa"/>
+              <w:left w:w="120" w:type="dxa"/>
+              <w:bottom w:w="80" w:type="dxa"/>
+              <w:right w:w="120" w:type="dxa"/>
+            </w:tcMar>
+          </w:tcPr>
+          <w:p>
+            <w:pPr>
+              <w:rPr>
+                <w:sz w:val="18"/>
+                <w:szCs w:val="18"/>
+              </w:rPr>
+            </w:pPr>
+            <w:r>
+              <w:rPr>
+                <w:sz w:val="18"/>
+                <w:szCs w:val="18"/>
+              </w:rPr>
+              <w:t>Grado di maturita' del livello attuale</w:t>
+            </w:r>
+          </w:p>
+        </w:tc>
+      </w:tr>
+      <w:tr>
+        <w:tc>
+          <w:tcPr>
+            <w:tcW w:w="1692" w:type="dxa"/>
+            <w:tcBorders>
+              <w:top w:val="single" w:sz="1" w:space="0" w:color="CCCCCC"/>
+              <w:left w:val="single" w:sz="1" w:space="0" w:color="CCCCCC"/>
+              <w:bottom w:val="single" w:sz="1" w:space="0" w:color="CCCCCC"/>
+              <w:right w:val="single" w:sz="1" w:space="0" w:color="CCCCCC"/>
+            </w:tcBorders>
+            <w:tcMar>
+              <w:top w:w="80" w:type="dxa"/>
+              <w:left w:w="120" w:type="dxa"/>
+              <w:bottom w:w="80" w:type="dxa"/>
+              <w:right w:w="120" w:type="dxa"/>
+            </w:tcMar>
+          </w:tcPr>
+          <w:p>
+            <w:pPr>
+              <w:rPr>
+                <w:sz w:val="18"/>
+                <w:szCs w:val="18"/>
+              </w:rPr>
+            </w:pPr>
+            <w:r>
+              <w:rPr>
+                <w:sz w:val="18"/>
+                <w:szCs w:val="18"/>
+              </w:rPr>
+              <w:t>data_valutazione</w:t>
+            </w:r>
+          </w:p>
+        </w:tc>
+        <w:tc>
+          <w:tcPr>
+            <w:tcW w:w="1574" w:type="dxa"/>
+            <w:tcBorders>
+              <w:top w:val="single" w:sz="1" w:space="0" w:color="CCCCCC"/>
+              <w:left w:val="single" w:sz="1" w:space="0" w:color="CCCCCC"/>
+              <w:bottom w:val="single" w:sz="1" w:space="0" w:color="CCCCCC"/>
+              <w:right w:val="single" w:sz="1" w:space="0" w:color="CCCCCC"/>
+            </w:tcBorders>
+            <w:tcMar>
+              <w:top w:w="80" w:type="dxa"/>
+              <w:left w:w="120" w:type="dxa"/>
+              <w:bottom w:w="80" w:type="dxa"/>
+              <w:right w:w="120" w:type="dxa"/>
+            </w:tcMar>
+          </w:tcPr>
+          <w:p>
+            <w:pPr>
+              <w:rPr>
+                <w:sz w:val="18"/>
+                <w:szCs w:val="18"/>
+              </w:rPr>
+            </w:pPr>
+            <w:r>
+              <w:rPr>
+                <w:sz w:val="18"/>
+                <w:szCs w:val="18"/>
+              </w:rPr>
+              <w:t>DATE</w:t>
+            </w:r>
+          </w:p>
+        </w:tc>
+        <w:tc>
+          <w:tcPr>
+            <w:tcW w:w="631" w:type="dxa"/>
+            <w:tcBorders>
+              <w:top w:val="single" w:sz="1" w:space="0" w:color="CCCCCC"/>
+              <w:left w:val="single" w:sz="1" w:space="0" w:color="CCCCCC"/>
+              <w:bottom w:val="single" w:sz="1" w:space="0" w:color="CCCCCC"/>
+              <w:right w:val="single" w:sz="1" w:space="0" w:color="CCCCCC"/>
+            </w:tcBorders>
+            <w:tcMar>
+              <w:top w:w="80" w:type="dxa"/>
+              <w:left w:w="120" w:type="dxa"/>
+              <w:bottom w:w="80" w:type="dxa"/>
+              <w:right w:w="120" w:type="dxa"/>
+            </w:tcMar>
+          </w:tcPr>
+          <w:p>
+            <w:pPr>
+              <w:rPr>
+                <w:sz w:val="18"/>
+                <w:szCs w:val="18"/>
+              </w:rPr>
+            </w:pPr>
+            <w:r>
+              <w:rPr>
+                <w:sz w:val="18"/>
+                <w:szCs w:val="18"/>
+              </w:rPr>
+              <w:t>Si</w:t>
+            </w:r>
+          </w:p>
+        </w:tc>
+        <w:tc>
+          <w:tcPr>
+            <w:tcW w:w="3423" w:type="dxa"/>
+            <w:tcBorders>
+              <w:top w:val="single" w:sz="1" w:space="0" w:color="CCCCCC"/>
+              <w:left w:val="single" w:sz="1" w:space="0" w:color="CCCCCC"/>
+              <w:bottom w:val="single" w:sz="1" w:space="0" w:color="CCCCCC"/>
+              <w:right w:val="single" w:sz="1" w:space="0" w:color="CCCCCC"/>
+            </w:tcBorders>
+            <w:tcMar>
+              <w:top w:w="80" w:type="dxa"/>
+              <w:left w:w="120" w:type="dxa"/>
+              <w:bottom w:w="80" w:type="dxa"/>
+              <w:right w:w="120" w:type="dxa"/>
+            </w:tcMar>
+          </w:tcPr>
+          <w:p>
+            <w:pPr>
+              <w:rPr>
+                <w:sz w:val="18"/>
+                <w:szCs w:val="18"/>
+              </w:rPr>
+            </w:pPr>
+            <w:r>
+              <w:rPr>
+                <w:sz w:val="18"/>
+                <w:szCs w:val="18"/>
+              </w:rPr>
+              <w:t>DEFAULT CURRENT_DATE</w:t>
+            </w:r>
+          </w:p>
+        </w:tc>
+        <w:tc>
+          <w:tcPr>
+            <w:tcW w:w="1755" w:type="dxa"/>
+            <w:tcBorders>
+              <w:top w:val="single" w:sz="1" w:space="0" w:color="CCCCCC"/>
+              <w:left w:val="single" w:sz="1" w:space="0" w:color="CCCCCC"/>
+              <w:bottom w:val="single" w:sz="1" w:space="0" w:color="CCCCCC"/>
+              <w:right w:val="single" w:sz="1" w:space="0" w:color="CCCCCC"/>
+            </w:tcBorders>
+            <w:tcMar>
+              <w:top w:w="80" w:type="dxa"/>
+              <w:left w:w="120" w:type="dxa"/>
+              <w:bottom w:w="80" w:type="dxa"/>
+              <w:right w:w="120" w:type="dxa"/>
+            </w:tcMar>
+          </w:tcPr>
+          <w:p>
+            <w:pPr>
+              <w:rPr>
+                <w:sz w:val="18"/>
+                <w:szCs w:val="18"/>
+              </w:rPr>
+            </w:pPr>
+            <w:r>
+              <w:rPr>
+                <w:sz w:val="18"/>
+                <w:szCs w:val="18"/>
+              </w:rPr>
+              <w:t>Data della valutazione</w:t>
+            </w:r>
+          </w:p>
+        </w:tc>
+      </w:tr>
+      <w:tr>
+        <w:tc>
+          <w:tcPr>
+            <w:tcW w:w="1692" w:type="dxa"/>
+            <w:tcBorders>
+              <w:top w:val="single" w:sz="1" w:space="0" w:color="CCCCCC"/>
+              <w:left w:val="single" w:sz="1" w:space="0" w:color="CCCCCC"/>
+              <w:bottom w:val="single" w:sz="1" w:space="0" w:color="CCCCCC"/>
+              <w:right w:val="single" w:sz="1" w:space="0" w:color="CCCCCC"/>
+            </w:tcBorders>
+            <w:tcMar>
+              <w:top w:w="80" w:type="dxa"/>
+              <w:left w:w="120" w:type="dxa"/>
+              <w:bottom w:w="80" w:type="dxa"/>
+              <w:right w:w="120" w:type="dxa"/>
+            </w:tcMar>
+          </w:tcPr>
+          <w:p>
+            <w:pPr>
+              <w:rPr>
+                <w:sz w:val="18"/>
+                <w:szCs w:val="18"/>
+              </w:rPr>
+            </w:pPr>
+            <w:r>
+              <w:rPr>
+                <w:sz w:val="18"/>
+                <w:szCs w:val="18"/>
+              </w:rPr>
+              <w:t>note</w:t>
+            </w:r>
+          </w:p>
+        </w:tc>
+        <w:tc>
+          <w:tcPr>
+            <w:tcW w:w="1574" w:type="dxa"/>
+            <w:tcBorders>
+              <w:top w:val="single" w:sz="1" w:space="0" w:color="CCCCCC"/>
+              <w:left w:val="single" w:sz="1" w:space="0" w:color="CCCCCC"/>
+              <w:bottom w:val="single" w:sz="1" w:space="0" w:color="CCCCCC"/>
+              <w:right w:val="single" w:sz="1" w:space="0" w:color="CCCCCC"/>
+            </w:tcBorders>
+            <w:tcMar>
+              <w:top w:w="80" w:type="dxa"/>
+              <w:left w:w="120" w:type="dxa"/>
+              <w:bottom w:w="80" w:type="dxa"/>
+              <w:right w:w="120" w:type="dxa"/>
+            </w:tcMar>
+          </w:tcPr>
+          <w:p>
+            <w:pPr>
+              <w:rPr>
+                <w:sz w:val="18"/>
+                <w:szCs w:val="18"/>
+              </w:rPr>
+            </w:pPr>
+            <w:r>
+              <w:rPr>
+                <w:sz w:val="18"/>
+                <w:szCs w:val="18"/>
+              </w:rPr>
+              <w:t>TEXT</w:t>
+            </w:r>
+          </w:p>
+        </w:tc>
+        <w:tc>
+          <w:tcPr>
+            <w:tcW w:w="631" w:type="dxa"/>
+            <w:tcBorders>
+              <w:top w:val="single" w:sz="1" w:space="0" w:color="CCCCCC"/>
+              <w:left w:val="single" w:sz="1" w:space="0" w:color="CCCCCC"/>
+              <w:bottom w:val="single" w:sz="1" w:space="0" w:color="CCCCCC"/>
+              <w:right w:val="single" w:sz="1" w:space="0" w:color="CCCCCC"/>
+            </w:tcBorders>
+            <w:tcMar>
+              <w:top w:w="80" w:type="dxa"/>
+              <w:left w:w="120" w:type="dxa"/>
+              <w:bottom w:w="80" w:type="dxa"/>
+              <w:right w:w="120" w:type="dxa"/>
+            </w:tcMar>
+          </w:tcPr>
+          <w:p>
+            <w:pPr>
+              <w:rPr>
+                <w:sz w:val="18"/>
+                <w:szCs w:val="18"/>
+              </w:rPr>
+            </w:pPr>
+            <w:r>
+              <w:rPr>
+                <w:sz w:val="18"/>
+                <w:szCs w:val="18"/>
+              </w:rPr>
+              <w:t>No</w:t>
+            </w:r>
+          </w:p>
+        </w:tc>
+        <w:tc>
+          <w:tcPr>
+            <w:tcW w:w="3423" w:type="dxa"/>
+            <w:tcBorders>
+              <w:top w:val="single" w:sz="1" w:space="0" w:color="CCCCCC"/>
+              <w:left w:val="single" w:sz="1" w:space="0" w:color="CCCCCC"/>
+              <w:bottom w:val="single" w:sz="1" w:space="0" w:color="CCCCCC"/>
+              <w:right w:val="single" w:sz="1" w:space="0" w:color="CCCCCC"/>
+            </w:tcBorders>
+            <w:tcMar>
+              <w:top w:w="80" w:type="dxa"/>
+              <w:left w:w="120" w:type="dxa"/>
+              <w:bottom w:w="80" w:type="dxa"/>
+              <w:right w:w="120" w:type="dxa"/>
+            </w:tcMar>
+          </w:tcPr>
+          <w:p>
+            <w:pPr>
+              <w:rPr>
+                <w:sz w:val="18"/>
+                <w:szCs w:val="18"/>
+              </w:rPr>
+            </w:pPr>
+            <w:r>
+              <w:rPr>
+                <w:sz w:val="18"/>
+                <w:szCs w:val="18"/>
+              </w:rPr>
+              <w:t>—</w:t>
+            </w:r>
+          </w:p>
+        </w:tc>
+        <w:tc>
+          <w:tcPr>
+            <w:tcW w:w="1755" w:type="dxa"/>
+            <w:tcBorders>
+              <w:top w:val="single" w:sz="1" w:space="0" w:color="CCCCCC"/>
+              <w:left w:val="single" w:sz="1" w:space="0" w:color="CCCCCC"/>
+              <w:bottom w:val="single" w:sz="1" w:space="0" w:color="CCCCCC"/>
+              <w:right w:val="single" w:sz="1" w:space="0" w:color="CCCCCC"/>
+            </w:tcBorders>
+            <w:tcMar>
+              <w:top w:w="80" w:type="dxa"/>
+              <w:left w:w="120" w:type="dxa"/>
+              <w:bottom w:w="80" w:type="dxa"/>
+              <w:right w:w="120" w:type="dxa"/>
+            </w:tcMar>
+          </w:tcPr>
+          <w:p>
+            <w:pPr>
+              <w:rPr>
+                <w:sz w:val="18"/>
+                <w:szCs w:val="18"/>
+              </w:rPr>
+            </w:pPr>
+            <w:r>
+              <w:rPr>
+                <w:sz w:val="18"/>
+                <w:szCs w:val="18"/>
+              </w:rPr>
+              <w:t>Annotazioni libere</w:t>
+            </w:r>
+          </w:p>
+        </w:tc>
+      </w:tr>
+    </w:tbl>
+    <w:p>
+      <w:pPr>
+        <w:jc w:val="both"/>
+        <w:rPr>
+          <w:color w:val="FF0000"/>
+          <w:sz w:val="20"/>
+        </w:rPr>
       </w:pPr>
     </w:p>
     <w:p>
+      <w:pPr>
+        <w:spacing w:after="240"/>
+        <w:jc w:val="both"/>
+      </w:pPr>
       <w:r>
-        <w:br w:type="page"/>
+        <w:t>Vincolo di unicita' sulla coppia (organizzazione_id, subcategory_cod): una sola valutazione corrente per Subcategory di ogni organizzazione.</w:t>
       </w:r>
     </w:p>
     <w:p>
@@ -24342,16 +27596,6 @@
     </w:p>
     <w:p>
       <w:pPr>
-        <w:spacing w:after="160"/>
-      </w:pPr>
-    </w:p>
-    <w:p>
-      <w:r>
-        <w:br w:type="page"/>
-      </w:r>
-    </w:p>
-    <w:p>
-      <w:pPr>
         <w:pStyle w:val="Heading1"/>
         <w:pBdr>
           <w:bottom w:val="single" w:sz="6" w:space="1" w:color="2E75B6"/>
@@ -24763,6 +28007,45 @@
       <w:pPr>
         <w:pStyle w:val="Heading2"/>
         <w:rPr>
+          <w:rFonts w:ascii="Arial" w:eastAsia="Arial" w:hAnsi="Arial" w:cs="Arial"/>
+          <w:b/>
+          <w:bCs/>
+          <w:color w:val="2E75B6"/>
+          <w:sz w:val="26"/>
+          <w:szCs w:val="26"/>
+        </w:rPr>
+      </w:pPr>
+      <w:r>
+        <w:rPr>
+          <w:rFonts w:ascii="Arial" w:eastAsia="Arial" w:hAnsi="Arial" w:cs="Arial"/>
+          <w:b/>
+          <w:bCs/>
+          <w:color w:val="2E75B6"/>
+          <w:sz w:val="26"/>
+          <w:szCs w:val="26"/>
+        </w:rPr>
+        <w:t>7.2 Viste per l'Assessment (Gap Analysis)</w:t>
+      </w:r>
+    </w:p>
+    <w:p>
+      <w:pPr>
+        <w:jc w:val="both"/>
+      </w:pPr>
+      <w:r>
+        <w:t>Quattro viste espongono i profili e il loro confronto: v_profilo_target e v_profilo_attuale restituiscono rispettivamente lo stato desiderato e quello rilevato; v_gap_analysis calcola il gap (target meno attuale) per ciascuna Subcategory, classificandolo come Raggiunto o Da colmare e ordinandolo per priorita'; v_gap_dashboard sintetizza per organizzazione le Subcategory raggiunte, quelle da colmare e la percentuale di completamento del profilo</w:t>
+      </w:r>
+      <w:r>
+        <w:rPr>
+          <w:color w:val="FF0000"/>
+          <w:sz w:val="20"/>
+        </w:rPr>
+        <w:t>.</w:t>
+      </w:r>
+    </w:p>
+    <w:p>
+      <w:pPr>
+        <w:pStyle w:val="Heading2"/>
+        <w:rPr>
           <w:lang w:val="en-US"/>
         </w:rPr>
       </w:pPr>
@@ -24776,7 +28059,31 @@
           <w:szCs w:val="26"/>
           <w:lang w:val="en-US"/>
         </w:rPr>
-        <w:t>7.2 Query di Export (nis2_export_csv.sql)</w:t>
+        <w:t>7.</w:t>
+      </w:r>
+      <w:r>
+        <w:rPr>
+          <w:rFonts w:ascii="Arial" w:eastAsia="Arial" w:hAnsi="Arial" w:cs="Arial"/>
+          <w:b/>
+          <w:bCs/>
+          <w:color w:val="2E75B6"/>
+          <w:sz w:val="26"/>
+          <w:szCs w:val="26"/>
+          <w:lang w:val="en-US"/>
+        </w:rPr>
+        <w:t>3</w:t>
+      </w:r>
+      <w:r>
+        <w:rPr>
+          <w:rFonts w:ascii="Arial" w:eastAsia="Arial" w:hAnsi="Arial" w:cs="Arial"/>
+          <w:b/>
+          <w:bCs/>
+          <w:color w:val="2E75B6"/>
+          <w:sz w:val="26"/>
+          <w:szCs w:val="26"/>
+          <w:lang w:val="en-US"/>
+        </w:rPr>
+        <w:t xml:space="preserve"> Query di Export (nis2_export_csv.sql)</w:t>
       </w:r>
     </w:p>
     <w:tbl>
@@ -29756,7 +33063,6 @@
     <w:basedOn w:val="DefaultParagraphFont"/>
     <w:link w:val="Heading2"/>
     <w:uiPriority w:val="9"/>
-    <w:semiHidden/>
     <w:rsid w:val="00C01370"/>
     <w:rPr>
       <w:rFonts w:asciiTheme="majorHAnsi" w:eastAsiaTheme="majorEastAsia" w:hAnsiTheme="majorHAnsi" w:cstheme="majorBidi"/>

</xml_diff>